<commit_message>
Explain the heapq import in the Huffman notebook
Just a short note on why we reach for a min-heap - it keeps handing back the
two smallest frequencies, which is the heart of building the tree.
</commit_message>
<xml_diff>
--- a/module-7-huffman-coding/module_7_huffman_coding.docx
+++ b/module-7-huffman-coding/module_7_huffman_coding.docx
@@ -169,7 +169,7 @@
         <w:t xml:space="preserve"> </w:t>
       </w:r>
       <w:r>
-        <w:t xml:space="preserve">(merge the two least-frequent items) and never reconsiders — and for this problem that greedy</w:t>
+        <w:t xml:space="preserve">(merge the two least-frequent items) and never reconsiders - and for this problem that greedy</w:t>
       </w:r>
       <w:r>
         <w:t xml:space="preserve"> </w:t>
@@ -196,7 +196,100 @@
         <w:pStyle w:val="FirstParagraph"/>
       </w:pPr>
       <w:r>
-        <w:t xml:space="preserve">Two rules drive everything:</w:t>
+        <w:t xml:space="preserve">The main idea is characters that appear more often should get shorter codes, while characters that appear less often can have longer codes. This saves space because the common characters are used more frequently.</w:t>
+      </w:r>
+    </w:p>
+    <w:p>
+      <w:pPr>
+        <w:pStyle w:val="BodyText"/>
+      </w:pPr>
+      <w:r>
+        <w:t xml:space="preserve">To make this happen, we repeatedly combine the two characters or groups with the smallest frequencies. The rare characters get combined first, which pushes them further down the tree and gives them longer codes. The more common characters are combined later, so they stay closer to the top and get shorter codes.</w:t>
+      </w:r>
+    </w:p>
+    <w:p>
+      <w:pPr>
+        <w:pStyle w:val="BodyText"/>
+      </w:pPr>
+      <w:r>
+        <w:t xml:space="preserve">A min-heap (priority queue) makes this process efficient because it lets us quickly find the two smallest frequencies. Each time we remove an item from the heap, the operation takes</w:t>
+      </w:r>
+      <w:r>
+        <w:t xml:space="preserve"> </w:t>
+      </w:r>
+      <w:r>
+        <w:rPr>
+          <w:b/>
+          <w:bCs/>
+        </w:rPr>
+        <w:t xml:space="preserve">O(log n)</w:t>
+      </w:r>
+      <w:r>
+        <w:t xml:space="preserve"> </w:t>
+      </w:r>
+      <w:r>
+        <w:t xml:space="preserve">time.</w:t>
+      </w:r>
+    </w:p>
+    <w:bookmarkEnd w:id="12"/>
+    <w:bookmarkEnd w:id="13"/>
+    <w:bookmarkStart w:id="14" w:name="Xd66a2ab86cd796ea9f9a0dd382f7bf284114f84"/>
+    <w:p>
+      <w:pPr>
+        <w:pStyle w:val="SourceCode"/>
+      </w:pPr>
+      <w:r>
+        <w:rPr>
+          <w:rStyle w:val="ImportTok"/>
+        </w:rPr>
+        <w:t xml:space="preserve">import</w:t>
+      </w:r>
+      <w:r>
+        <w:rPr>
+          <w:rStyle w:val="NormalTok"/>
+        </w:rPr>
+        <w:t xml:space="preserve"> heapq  </w:t>
+      </w:r>
+      <w:r>
+        <w:rPr>
+          <w:rStyle w:val="CommentTok"/>
+        </w:rPr>
+        <w:t xml:space="preserve"># min-heap (priority queue): always hands back the smallest item first,</w:t>
+      </w:r>
+      <w:r>
+        <w:br/>
+      </w:r>
+      <w:r>
+        <w:rPr>
+          <w:rStyle w:val="NormalTok"/>
+        </w:rPr>
+        <w:t xml:space="preserve">              </w:t>
+      </w:r>
+      <w:r>
+        <w:rPr>
+          <w:rStyle w:val="CommentTok"/>
+        </w:rPr>
+        <w:t xml:space="preserve"># which is how we keep pulling the two lowest-frequency nodes to merge</w:t>
+      </w:r>
+    </w:p>
+    <w:bookmarkEnd w:id="14"/>
+    <w:bookmarkStart w:id="16" w:name="X9c24649383a4f6f5268b691df9146882df96d93"/>
+    <w:bookmarkStart w:id="15" w:name="build_tree--the-greedy-merging"/>
+    <w:p>
+      <w:pPr>
+        <w:pStyle w:val="Heading3"/>
+      </w:pPr>
+      <w:r>
+        <w:rPr>
+          <w:rStyle w:val="VerbatimChar"/>
+        </w:rPr>
+        <w:t xml:space="preserve">build_tree</w:t>
+      </w:r>
+      <w:r>
+        <w:t xml:space="preserve"> </w:t>
+      </w:r>
+      <w:r>
+        <w:t xml:space="preserve">— the greedy merging</w:t>
       </w:r>
     </w:p>
     <w:p>
@@ -208,17 +301,19 @@
         </w:numPr>
       </w:pPr>
       <w:r>
-        <w:rPr>
-          <w:b/>
-          <w:bCs/>
-        </w:rPr>
-        <w:t xml:space="preserve">Frequent → short code, rare → long code.</w:t>
-      </w:r>
-      <w:r>
-        <w:t xml:space="preserve"> </w:t>
-      </w:r>
-      <w:r>
-        <w:t xml:space="preserve">That is where the saving comes from.</w:t>
+        <w:t xml:space="preserve">Start with one heap entry per character:</w:t>
+      </w:r>
+      <w:r>
+        <w:t xml:space="preserve"> </w:t>
+      </w:r>
+      <w:r>
+        <w:rPr>
+          <w:rStyle w:val="VerbatimChar"/>
+        </w:rPr>
+        <w:t xml:space="preserve">(frequency, tie-breaker, node)</w:t>
+      </w:r>
+      <w:r>
+        <w:t xml:space="preserve">.</w:t>
       </w:r>
     </w:p>
     <w:p>
@@ -230,170 +325,998 @@
         </w:numPr>
       </w:pPr>
       <w:r>
+        <w:t xml:space="preserve">A</w:t>
+      </w:r>
+      <w:r>
+        <w:t xml:space="preserve"> </w:t>
+      </w:r>
+      <w:r>
         <w:rPr>
           <w:b/>
           <w:bCs/>
         </w:rPr>
-        <w:t xml:space="preserve">To achieve rule 1, repeatedly merge the two</w:t>
+        <w:t xml:space="preserve">node</w:t>
+      </w:r>
+      <w:r>
+        <w:t xml:space="preserve"> </w:t>
+      </w:r>
+      <w:r>
+        <w:t xml:space="preserve">is either a single character (a</w:t>
+      </w:r>
+      <w:r>
+        <w:t xml:space="preserve"> </w:t>
+      </w:r>
+      <w:r>
+        <w:rPr>
+          <w:i/>
+          <w:iCs/>
+        </w:rPr>
+        <w:t xml:space="preserve">leaf</w:t>
+      </w:r>
+      <w:r>
+        <w:t xml:space="preserve">) or a</w:t>
+      </w:r>
+      <w:r>
+        <w:t xml:space="preserve"> </w:t>
+      </w:r>
+      <w:r>
+        <w:rPr>
+          <w:rStyle w:val="VerbatimChar"/>
+        </w:rPr>
+        <w:t xml:space="preserve">(left, right)</w:t>
+      </w:r>
+      <w:r>
+        <w:t xml:space="preserve"> </w:t>
+      </w:r>
+      <w:r>
+        <w:t xml:space="preserve">pair (an</w:t>
+      </w:r>
+      <w:r>
+        <w:t xml:space="preserve"> </w:t>
+      </w:r>
+      <w:r>
+        <w:rPr>
+          <w:i/>
+          <w:iCs/>
+        </w:rPr>
+        <w:t xml:space="preserve">internal</w:t>
+      </w:r>
+      <w:r>
+        <w:t xml:space="preserve"> </w:t>
+      </w:r>
+      <w:r>
+        <w:t xml:space="preserve">node).</w:t>
+      </w:r>
+    </w:p>
+    <w:p>
+      <w:pPr>
+        <w:pStyle w:val="Compact"/>
+        <w:numPr>
+          <w:ilvl w:val="0"/>
+          <w:numId w:val="1001"/>
+        </w:numPr>
+      </w:pPr>
+      <w:r>
+        <w:t xml:space="preserve">Pop the two smallest, fuse them into a new node whose frequency is their</w:t>
+      </w:r>
+      <w:r>
+        <w:t xml:space="preserve"> </w:t>
       </w:r>
       <w:r>
         <w:rPr>
           <w:b/>
           <w:bCs/>
         </w:rPr>
+        <w:t xml:space="preserve">sum</w:t>
+      </w:r>
+      <w:r>
+        <w:t xml:space="preserve">, push it back.</w:t>
+      </w:r>
+    </w:p>
+    <w:p>
+      <w:pPr>
+        <w:pStyle w:val="Compact"/>
+        <w:numPr>
+          <w:ilvl w:val="0"/>
+          <w:numId w:val="1001"/>
+        </w:numPr>
+      </w:pPr>
+      <w:r>
+        <w:t xml:space="preserve">Repeat until a single node is left — that is the</w:t>
+      </w:r>
+      <w:r>
         <w:t xml:space="preserve"> </w:t>
       </w:r>
       <w:r>
         <w:rPr>
           <w:b/>
           <w:bCs/>
+        </w:rPr>
+        <w:t xml:space="preserve">root</w:t>
+      </w:r>
+      <w:r>
+        <w:t xml:space="preserve"> </w:t>
+      </w:r>
+      <w:r>
+        <w:t xml:space="preserve">of the Huffman tree.</w:t>
+      </w:r>
+    </w:p>
+    <w:p>
+      <w:pPr>
+        <w:pStyle w:val="FirstParagraph"/>
+      </w:pPr>
+      <w:r>
+        <w:t xml:space="preserve">The</w:t>
+      </w:r>
+      <w:r>
+        <w:t xml:space="preserve"> </w:t>
+      </w:r>
+      <w:r>
+        <w:rPr>
+          <w:rStyle w:val="VerbatimChar"/>
+        </w:rPr>
+        <w:t xml:space="preserve">counter</w:t>
+      </w:r>
+      <w:r>
+        <w:t xml:space="preserve"> </w:t>
+      </w:r>
+      <w:r>
+        <w:t xml:space="preserve">is only there to break ties deterministically when two frequencies are equal</w:t>
+      </w:r>
+      <w:r>
+        <w:t xml:space="preserve"> </w:t>
+      </w:r>
+      <w:r>
+        <w:t xml:space="preserve">(so Python never has to compare two</w:t>
+      </w:r>
+      <w:r>
+        <w:t xml:space="preserve"> </w:t>
+      </w:r>
+      <w:r>
+        <w:rPr>
+          <w:rStyle w:val="VerbatimChar"/>
+        </w:rPr>
+        <w:t xml:space="preserve">(left, right)</w:t>
+      </w:r>
+      <w:r>
+        <w:t xml:space="preserve"> </w:t>
+      </w:r>
+      <w:r>
+        <w:t xml:space="preserve">tuples).</w:t>
+      </w:r>
+    </w:p>
+    <w:bookmarkEnd w:id="15"/>
+    <w:bookmarkEnd w:id="16"/>
+    <w:bookmarkStart w:id="17" w:name="ae613168"/>
+    <w:p>
+      <w:pPr>
+        <w:pStyle w:val="SourceCode"/>
+      </w:pPr>
+      <w:r>
+        <w:rPr>
+          <w:rStyle w:val="KeywordTok"/>
+        </w:rPr>
+        <w:t xml:space="preserve">def</w:t>
+      </w:r>
+      <w:r>
+        <w:rPr>
+          <w:rStyle w:val="NormalTok"/>
+        </w:rPr>
+        <w:t xml:space="preserve"> build_tree(frequencies):</w:t>
+      </w:r>
+      <w:r>
+        <w:br/>
+      </w:r>
+      <w:r>
+        <w:rPr>
+          <w:rStyle w:val="NormalTok"/>
+        </w:rPr>
+        <w:t xml:space="preserve">    </w:t>
+      </w:r>
+      <w:r>
+        <w:rPr>
+          <w:rStyle w:val="CommentTok"/>
+        </w:rPr>
+        <w:t xml:space="preserve">"""Merge the two smallest frequencies until one node (the root) is left."""</w:t>
+      </w:r>
+      <w:r>
+        <w:br/>
+      </w:r>
+      <w:r>
+        <w:rPr>
+          <w:rStyle w:val="NormalTok"/>
+        </w:rPr>
+        <w:t xml:space="preserve">    heap </w:t>
+      </w:r>
+      <w:r>
+        <w:rPr>
+          <w:rStyle w:val="OperatorTok"/>
+        </w:rPr>
+        <w:t xml:space="preserve">=</w:t>
+      </w:r>
+      <w:r>
+        <w:rPr>
+          <w:rStyle w:val="NormalTok"/>
+        </w:rPr>
+        <w:t xml:space="preserve"> [(freq, i, char) </w:t>
+      </w:r>
+      <w:r>
+        <w:rPr>
+          <w:rStyle w:val="ControlFlowTok"/>
+        </w:rPr>
+        <w:t xml:space="preserve">for</w:t>
+      </w:r>
+      <w:r>
+        <w:rPr>
+          <w:rStyle w:val="NormalTok"/>
+        </w:rPr>
+        <w:t xml:space="preserve"> i, (char, freq) </w:t>
+      </w:r>
+      <w:r>
+        <w:rPr>
+          <w:rStyle w:val="KeywordTok"/>
+        </w:rPr>
+        <w:t xml:space="preserve">in</w:t>
+      </w:r>
+      <w:r>
+        <w:rPr>
+          <w:rStyle w:val="NormalTok"/>
+        </w:rPr>
+        <w:t xml:space="preserve"> </w:t>
+      </w:r>
+      <w:r>
+        <w:rPr>
+          <w:rStyle w:val="BuiltInTok"/>
+        </w:rPr>
+        <w:t xml:space="preserve">enumerate</w:t>
+      </w:r>
+      <w:r>
+        <w:rPr>
+          <w:rStyle w:val="NormalTok"/>
+        </w:rPr>
+        <w:t xml:space="preserve">(frequencies.items())]</w:t>
+      </w:r>
+      <w:r>
+        <w:br/>
+      </w:r>
+      <w:r>
+        <w:rPr>
+          <w:rStyle w:val="NormalTok"/>
+        </w:rPr>
+        <w:t xml:space="preserve">    heapq.heapify(heap)                          </w:t>
+      </w:r>
+      <w:r>
+        <w:rPr>
+          <w:rStyle w:val="CommentTok"/>
+        </w:rPr>
+        <w:t xml:space="preserve"># min-heap = priority queue</w:t>
+      </w:r>
+      <w:r>
+        <w:br/>
+      </w:r>
+      <w:r>
+        <w:rPr>
+          <w:rStyle w:val="NormalTok"/>
+        </w:rPr>
+        <w:t xml:space="preserve">    counter </w:t>
+      </w:r>
+      <w:r>
+        <w:rPr>
+          <w:rStyle w:val="OperatorTok"/>
+        </w:rPr>
+        <w:t xml:space="preserve">=</w:t>
+      </w:r>
+      <w:r>
+        <w:rPr>
+          <w:rStyle w:val="NormalTok"/>
+        </w:rPr>
+        <w:t xml:space="preserve"> </w:t>
+      </w:r>
+      <w:r>
+        <w:rPr>
+          <w:rStyle w:val="BuiltInTok"/>
+        </w:rPr>
+        <w:t xml:space="preserve">len</w:t>
+      </w:r>
+      <w:r>
+        <w:rPr>
+          <w:rStyle w:val="NormalTok"/>
+        </w:rPr>
+        <w:t xml:space="preserve">(heap)</w:t>
+      </w:r>
+      <w:r>
+        <w:br/>
+      </w:r>
+      <w:r>
+        <w:br/>
+      </w:r>
+      <w:r>
+        <w:rPr>
+          <w:rStyle w:val="NormalTok"/>
+        </w:rPr>
+        <w:t xml:space="preserve">    </w:t>
+      </w:r>
+      <w:r>
+        <w:rPr>
+          <w:rStyle w:val="ControlFlowTok"/>
+        </w:rPr>
+        <w:t xml:space="preserve">while</w:t>
+      </w:r>
+      <w:r>
+        <w:rPr>
+          <w:rStyle w:val="NormalTok"/>
+        </w:rPr>
+        <w:t xml:space="preserve"> </w:t>
+      </w:r>
+      <w:r>
+        <w:rPr>
+          <w:rStyle w:val="BuiltInTok"/>
+        </w:rPr>
+        <w:t xml:space="preserve">len</w:t>
+      </w:r>
+      <w:r>
+        <w:rPr>
+          <w:rStyle w:val="NormalTok"/>
+        </w:rPr>
+        <w:t xml:space="preserve">(heap) </w:t>
+      </w:r>
+      <w:r>
+        <w:rPr>
+          <w:rStyle w:val="OperatorTok"/>
+        </w:rPr>
+        <w:t xml:space="preserve">&gt;</w:t>
+      </w:r>
+      <w:r>
+        <w:rPr>
+          <w:rStyle w:val="NormalTok"/>
+        </w:rPr>
+        <w:t xml:space="preserve"> </w:t>
+      </w:r>
+      <w:r>
+        <w:rPr>
+          <w:rStyle w:val="DecValTok"/>
+        </w:rPr>
+        <w:t xml:space="preserve">1</w:t>
+      </w:r>
+      <w:r>
+        <w:rPr>
+          <w:rStyle w:val="NormalTok"/>
+        </w:rPr>
+        <w:t xml:space="preserve">:</w:t>
+      </w:r>
+      <w:r>
+        <w:br/>
+      </w:r>
+      <w:r>
+        <w:rPr>
+          <w:rStyle w:val="NormalTok"/>
+        </w:rPr>
+        <w:t xml:space="preserve">        freq_a, _, node_a </w:t>
+      </w:r>
+      <w:r>
+        <w:rPr>
+          <w:rStyle w:val="OperatorTok"/>
+        </w:rPr>
+        <w:t xml:space="preserve">=</w:t>
+      </w:r>
+      <w:r>
+        <w:rPr>
+          <w:rStyle w:val="NormalTok"/>
+        </w:rPr>
+        <w:t xml:space="preserve"> heapq.heappop(heap)  </w:t>
+      </w:r>
+      <w:r>
+        <w:rPr>
+          <w:rStyle w:val="CommentTok"/>
+        </w:rPr>
+        <w:t xml:space="preserve"># smallest</w:t>
+      </w:r>
+      <w:r>
+        <w:br/>
+      </w:r>
+      <w:r>
+        <w:rPr>
+          <w:rStyle w:val="NormalTok"/>
+        </w:rPr>
+        <w:t xml:space="preserve">        freq_b, _, node_b </w:t>
+      </w:r>
+      <w:r>
+        <w:rPr>
+          <w:rStyle w:val="OperatorTok"/>
+        </w:rPr>
+        <w:t xml:space="preserve">=</w:t>
+      </w:r>
+      <w:r>
+        <w:rPr>
+          <w:rStyle w:val="NormalTok"/>
+        </w:rPr>
+        <w:t xml:space="preserve"> heapq.heappop(heap)  </w:t>
+      </w:r>
+      <w:r>
+        <w:rPr>
+          <w:rStyle w:val="CommentTok"/>
+        </w:rPr>
+        <w:t xml:space="preserve"># second smallest</w:t>
+      </w:r>
+      <w:r>
+        <w:br/>
+      </w:r>
+      <w:r>
+        <w:rPr>
+          <w:rStyle w:val="NormalTok"/>
+        </w:rPr>
+        <w:t xml:space="preserve">        heapq.heappush(heap, (freq_a </w:t>
+      </w:r>
+      <w:r>
+        <w:rPr>
+          <w:rStyle w:val="OperatorTok"/>
+        </w:rPr>
+        <w:t xml:space="preserve">+</w:t>
+      </w:r>
+      <w:r>
+        <w:rPr>
+          <w:rStyle w:val="NormalTok"/>
+        </w:rPr>
+        <w:t xml:space="preserve"> freq_b, counter, (node_a, node_b)))</w:t>
+      </w:r>
+      <w:r>
+        <w:br/>
+      </w:r>
+      <w:r>
+        <w:rPr>
+          <w:rStyle w:val="NormalTok"/>
+        </w:rPr>
+        <w:t xml:space="preserve">        counter </w:t>
+      </w:r>
+      <w:r>
+        <w:rPr>
+          <w:rStyle w:val="OperatorTok"/>
+        </w:rPr>
+        <w:t xml:space="preserve">+=</w:t>
+      </w:r>
+      <w:r>
+        <w:rPr>
+          <w:rStyle w:val="NormalTok"/>
+        </w:rPr>
+        <w:t xml:space="preserve"> </w:t>
+      </w:r>
+      <w:r>
+        <w:rPr>
+          <w:rStyle w:val="DecValTok"/>
+        </w:rPr>
+        <w:t xml:space="preserve">1</w:t>
+      </w:r>
+      <w:r>
+        <w:br/>
+      </w:r>
+      <w:r>
+        <w:br/>
+      </w:r>
+      <w:r>
+        <w:rPr>
+          <w:rStyle w:val="NormalTok"/>
+        </w:rPr>
+        <w:t xml:space="preserve">    </w:t>
+      </w:r>
+      <w:r>
+        <w:rPr>
+          <w:rStyle w:val="ControlFlowTok"/>
+        </w:rPr>
+        <w:t xml:space="preserve">return</w:t>
+      </w:r>
+      <w:r>
+        <w:rPr>
+          <w:rStyle w:val="NormalTok"/>
+        </w:rPr>
+        <w:t xml:space="preserve"> heap[</w:t>
+      </w:r>
+      <w:r>
+        <w:rPr>
+          <w:rStyle w:val="DecValTok"/>
+        </w:rPr>
+        <w:t xml:space="preserve">0</w:t>
+      </w:r>
+      <w:r>
+        <w:rPr>
+          <w:rStyle w:val="NormalTok"/>
+        </w:rPr>
+        <w:t xml:space="preserve">][</w:t>
+      </w:r>
+      <w:r>
+        <w:rPr>
+          <w:rStyle w:val="DecValTok"/>
+        </w:rPr>
+        <w:t xml:space="preserve">2</w:t>
+      </w:r>
+      <w:r>
+        <w:rPr>
+          <w:rStyle w:val="NormalTok"/>
+        </w:rPr>
+        <w:t xml:space="preserve">]                            </w:t>
+      </w:r>
+      <w:r>
+        <w:rPr>
+          <w:rStyle w:val="CommentTok"/>
+        </w:rPr>
+        <w:t xml:space="preserve"># the root node</w:t>
+      </w:r>
+    </w:p>
+    <w:bookmarkEnd w:id="17"/>
+    <w:bookmarkStart w:id="19" w:name="fcf92a31"/>
+    <w:bookmarkStart w:id="18" w:name="build_codes--read-the-codes-off-the-tree"/>
+    <w:p>
+      <w:pPr>
+        <w:pStyle w:val="Heading3"/>
+      </w:pPr>
+      <w:r>
+        <w:rPr>
+          <w:rStyle w:val="VerbatimChar"/>
+        </w:rPr>
+        <w:t xml:space="preserve">build_codes</w:t>
+      </w:r>
+      <w:r>
+        <w:t xml:space="preserve"> </w:t>
+      </w:r>
+      <w:r>
+        <w:t xml:space="preserve">— read the codes off the tree</w:t>
+      </w:r>
+    </w:p>
+    <w:p>
+      <w:pPr>
+        <w:pStyle w:val="FirstParagraph"/>
+      </w:pPr>
+      <w:r>
+        <w:t xml:space="preserve">Walk down from the root.</w:t>
+      </w:r>
+      <w:r>
+        <w:t xml:space="preserve"> </w:t>
+      </w:r>
+      <w:r>
+        <w:rPr>
+          <w:b/>
+          <w:bCs/>
+        </w:rPr>
+        <w:t xml:space="preserve">Every left turn appends</w:t>
+      </w:r>
+      <w:r>
+        <w:rPr>
+          <w:b/>
+          <w:bCs/>
+        </w:rPr>
+        <w:t xml:space="preserve"> </w:t>
+      </w:r>
+      <w:r>
+        <w:rPr>
+          <w:rStyle w:val="VerbatimChar"/>
+          <w:b/>
+          <w:bCs/>
+        </w:rPr>
+        <w:t xml:space="preserve">0</w:t>
+      </w:r>
+      <w:r>
+        <w:rPr>
+          <w:b/>
+          <w:bCs/>
+        </w:rPr>
+        <w:t xml:space="preserve">, every right turn appends</w:t>
+      </w:r>
+      <w:r>
+        <w:rPr>
+          <w:b/>
+          <w:bCs/>
+        </w:rPr>
+        <w:t xml:space="preserve"> </w:t>
+      </w:r>
+      <w:r>
+        <w:rPr>
+          <w:rStyle w:val="VerbatimChar"/>
+          <w:b/>
+          <w:bCs/>
+        </w:rPr>
+        <w:t xml:space="preserve">1</w:t>
+      </w:r>
+      <w:r>
+        <w:rPr>
+          <w:b/>
+          <w:bCs/>
+        </w:rPr>
+        <w:t xml:space="preserve">.</w:t>
+      </w:r>
+      <w:r>
+        <w:t xml:space="preserve"> </w:t>
+      </w:r>
+      <w:r>
+        <w:t xml:space="preserve">When we reach a leaf (a</w:t>
+      </w:r>
+      <w:r>
+        <w:t xml:space="preserve"> </w:t>
+      </w:r>
+      <w:r>
+        <w:rPr>
+          <w:rStyle w:val="VerbatimChar"/>
+        </w:rPr>
+        <w:t xml:space="preserve">str</w:t>
+      </w:r>
+      <w:r>
+        <w:t xml:space="preserve">), the string we have accumulated</w:t>
+      </w:r>
+      <w:r>
+        <w:t xml:space="preserve"> </w:t>
+      </w:r>
+      <w:r>
+        <w:rPr>
           <w:i/>
           <w:iCs/>
         </w:rPr>
-        <w:t xml:space="preserve">smallest</w:t>
+        <w:t xml:space="preserve">is</w:t>
+      </w:r>
+      <w:r>
+        <w:t xml:space="preserve"> </w:t>
+      </w:r>
+      <w:r>
+        <w:t xml:space="preserve">that character's code.</w:t>
+      </w:r>
+    </w:p>
+    <w:p>
+      <w:pPr>
+        <w:pStyle w:val="BodyText"/>
+      </w:pPr>
+      <w:r>
+        <w:t xml:space="preserve">Because characters live only at the leaves, no code is ever a</w:t>
+      </w:r>
+      <w:r>
+        <w:t xml:space="preserve"> </w:t>
+      </w:r>
+      <w:r>
+        <w:rPr>
+          <w:i/>
+          <w:iCs/>
+        </w:rPr>
+        <w:t xml:space="preserve">prefix</w:t>
+      </w:r>
+      <w:r>
+        <w:t xml:space="preserve"> </w:t>
+      </w:r>
+      <w:r>
+        <w:t xml:space="preserve">of another — this is a</w:t>
+      </w:r>
+      <w:r>
+        <w:t xml:space="preserve"> </w:t>
       </w:r>
       <w:r>
         <w:rPr>
           <w:b/>
           <w:bCs/>
         </w:rPr>
-        <w:t xml:space="preserve"> </w:t>
-      </w:r>
-      <w:r>
-        <w:rPr>
-          <w:b/>
-          <w:bCs/>
-        </w:rPr>
-        <w:t xml:space="preserve">frequencies.</w:t>
-      </w:r>
-      <w:r>
-        <w:t xml:space="preserve"> </w:t>
-      </w:r>
-      <w:r>
-        <w:t xml:space="preserve">The rarest characters</w:t>
-      </w:r>
-      <w:r>
-        <w:t xml:space="preserve"> </w:t>
-      </w:r>
-      <w:r>
-        <w:t xml:space="preserve">get merged first, so they sink to the</w:t>
-      </w:r>
-      <w:r>
-        <w:t xml:space="preserve"> </w:t>
-      </w:r>
-      <w:r>
-        <w:rPr>
-          <w:i/>
-          <w:iCs/>
-        </w:rPr>
-        <w:t xml:space="preserve">bottom</w:t>
-      </w:r>
-      <w:r>
-        <w:t xml:space="preserve"> </w:t>
-      </w:r>
-      <w:r>
-        <w:t xml:space="preserve">of the tree (long codes); the most frequent</w:t>
-      </w:r>
-      <w:r>
-        <w:t xml:space="preserve"> </w:t>
-      </w:r>
-      <w:r>
-        <w:t xml:space="preserve">character is merged last, so it stays near the</w:t>
-      </w:r>
-      <w:r>
-        <w:t xml:space="preserve"> </w:t>
-      </w:r>
-      <w:r>
-        <w:rPr>
-          <w:i/>
-          <w:iCs/>
-        </w:rPr>
-        <w:t xml:space="preserve">top</w:t>
-      </w:r>
-      <w:r>
-        <w:t xml:space="preserve"> </w:t>
-      </w:r>
-      <w:r>
-        <w:t xml:space="preserve">(short code).</w:t>
+        <w:t xml:space="preserve">prefix code</w:t>
+      </w:r>
+      <w:r>
+        <w:t xml:space="preserve">, which is exactly what lets the decoder work with no separators between codes.</w:t>
       </w:r>
     </w:p>
+    <w:bookmarkEnd w:id="18"/>
+    <w:bookmarkEnd w:id="19"/>
+    <w:bookmarkStart w:id="20" w:name="fbb8b5c5"/>
     <w:p>
       <w:pPr>
-        <w:pStyle w:val="FirstParagraph"/>
-      </w:pPr>
-      <w:r>
-        <w:t xml:space="preserve">We use a</w:t>
-      </w:r>
-      <w:r>
-        <w:t xml:space="preserve"> </w:t>
-      </w:r>
-      <w:r>
-        <w:rPr>
-          <w:b/>
-          <w:bCs/>
-        </w:rPr>
-        <w:t xml:space="preserve">min-heap</w:t>
-      </w:r>
-      <w:r>
-        <w:t xml:space="preserve"> </w:t>
-      </w:r>
-      <w:r>
-        <w:t xml:space="preserve">(priority queue) so that "give me the two smallest" is fast —</w:t>
-      </w:r>
-      <w:r>
-        <w:t xml:space="preserve"> </w:t>
-      </w:r>
-      <w:r>
-        <w:rPr>
-          <w:rStyle w:val="VerbatimChar"/>
-        </w:rPr>
-        <w:t xml:space="preserve">O(log n)</w:t>
-      </w:r>
-      <w:r>
-        <w:t xml:space="preserve"> </w:t>
-      </w:r>
-      <w:r>
-        <w:t xml:space="preserve">per pop.</w:t>
+        <w:pStyle w:val="SourceCode"/>
+      </w:pPr>
+      <w:r>
+        <w:rPr>
+          <w:rStyle w:val="KeywordTok"/>
+        </w:rPr>
+        <w:t xml:space="preserve">def</w:t>
+      </w:r>
+      <w:r>
+        <w:rPr>
+          <w:rStyle w:val="NormalTok"/>
+        </w:rPr>
+        <w:t xml:space="preserve"> build_codes(node, prefix</w:t>
+      </w:r>
+      <w:r>
+        <w:rPr>
+          <w:rStyle w:val="OperatorTok"/>
+        </w:rPr>
+        <w:t xml:space="preserve">=</w:t>
+      </w:r>
+      <w:r>
+        <w:rPr>
+          <w:rStyle w:val="StringTok"/>
+        </w:rPr>
+        <w:t xml:space="preserve">""</w:t>
+      </w:r>
+      <w:r>
+        <w:rPr>
+          <w:rStyle w:val="NormalTok"/>
+        </w:rPr>
+        <w:t xml:space="preserve">):</w:t>
+      </w:r>
+      <w:r>
+        <w:br/>
+      </w:r>
+      <w:r>
+        <w:rPr>
+          <w:rStyle w:val="NormalTok"/>
+        </w:rPr>
+        <w:t xml:space="preserve">    </w:t>
+      </w:r>
+      <w:r>
+        <w:rPr>
+          <w:rStyle w:val="CommentTok"/>
+        </w:rPr>
+        <w:t xml:space="preserve">"""</w:t>
+      </w:r>
+      <w:r>
+        <w:br/>
+      </w:r>
+      <w:r>
+        <w:rPr>
+          <w:rStyle w:val="CommentTok"/>
+        </w:rPr>
+        <w:t xml:space="preserve">    Walk the tree: left adds '0', right adds '1'. Leaves hold the final code.</w:t>
+      </w:r>
+      <w:r>
+        <w:br/>
+      </w:r>
+      <w:r>
+        <w:rPr>
+          <w:rStyle w:val="CommentTok"/>
+        </w:rPr>
+        <w:t xml:space="preserve">    """</w:t>
+      </w:r>
+      <w:r>
+        <w:br/>
+      </w:r>
+      <w:r>
+        <w:rPr>
+          <w:rStyle w:val="NormalTok"/>
+        </w:rPr>
+        <w:t xml:space="preserve">    </w:t>
+      </w:r>
+      <w:r>
+        <w:rPr>
+          <w:rStyle w:val="ControlFlowTok"/>
+        </w:rPr>
+        <w:t xml:space="preserve">if</w:t>
+      </w:r>
+      <w:r>
+        <w:rPr>
+          <w:rStyle w:val="NormalTok"/>
+        </w:rPr>
+        <w:t xml:space="preserve"> </w:t>
+      </w:r>
+      <w:r>
+        <w:rPr>
+          <w:rStyle w:val="BuiltInTok"/>
+        </w:rPr>
+        <w:t xml:space="preserve">isinstance</w:t>
+      </w:r>
+      <w:r>
+        <w:rPr>
+          <w:rStyle w:val="NormalTok"/>
+        </w:rPr>
+        <w:t xml:space="preserve">(node, </w:t>
+      </w:r>
+      <w:r>
+        <w:rPr>
+          <w:rStyle w:val="BuiltInTok"/>
+        </w:rPr>
+        <w:t xml:space="preserve">str</w:t>
+      </w:r>
+      <w:r>
+        <w:rPr>
+          <w:rStyle w:val="NormalTok"/>
+        </w:rPr>
+        <w:t xml:space="preserve">):                    </w:t>
+      </w:r>
+      <w:r>
+        <w:rPr>
+          <w:rStyle w:val="CommentTok"/>
+        </w:rPr>
+        <w:t xml:space="preserve"># a leaf -&gt; code is complete</w:t>
+      </w:r>
+      <w:r>
+        <w:br/>
+      </w:r>
+      <w:r>
+        <w:rPr>
+          <w:rStyle w:val="NormalTok"/>
+        </w:rPr>
+        <w:t xml:space="preserve">        </w:t>
+      </w:r>
+      <w:r>
+        <w:rPr>
+          <w:rStyle w:val="ControlFlowTok"/>
+        </w:rPr>
+        <w:t xml:space="preserve">return</w:t>
+      </w:r>
+      <w:r>
+        <w:rPr>
+          <w:rStyle w:val="NormalTok"/>
+        </w:rPr>
+        <w:t xml:space="preserve"> {node: prefix </w:t>
+      </w:r>
+      <w:r>
+        <w:rPr>
+          <w:rStyle w:val="KeywordTok"/>
+        </w:rPr>
+        <w:t xml:space="preserve">or</w:t>
+      </w:r>
+      <w:r>
+        <w:rPr>
+          <w:rStyle w:val="NormalTok"/>
+        </w:rPr>
+        <w:t xml:space="preserve"> </w:t>
+      </w:r>
+      <w:r>
+        <w:rPr>
+          <w:rStyle w:val="StringTok"/>
+        </w:rPr>
+        <w:t xml:space="preserve">"0"</w:t>
+      </w:r>
+      <w:r>
+        <w:rPr>
+          <w:rStyle w:val="NormalTok"/>
+        </w:rPr>
+        <w:t xml:space="preserve">}             </w:t>
+      </w:r>
+      <w:r>
+        <w:rPr>
+          <w:rStyle w:val="CommentTok"/>
+        </w:rPr>
+        <w:t xml:space="preserve"># 'or "0"' handles a 1-character alphabet</w:t>
+      </w:r>
+      <w:r>
+        <w:br/>
+      </w:r>
+      <w:r>
+        <w:br/>
+      </w:r>
+      <w:r>
+        <w:rPr>
+          <w:rStyle w:val="NormalTok"/>
+        </w:rPr>
+        <w:t xml:space="preserve">    left, right </w:t>
+      </w:r>
+      <w:r>
+        <w:rPr>
+          <w:rStyle w:val="OperatorTok"/>
+        </w:rPr>
+        <w:t xml:space="preserve">=</w:t>
+      </w:r>
+      <w:r>
+        <w:rPr>
+          <w:rStyle w:val="NormalTok"/>
+        </w:rPr>
+        <w:t xml:space="preserve"> node</w:t>
+      </w:r>
+      <w:r>
+        <w:br/>
+      </w:r>
+      <w:r>
+        <w:rPr>
+          <w:rStyle w:val="NormalTok"/>
+        </w:rPr>
+        <w:t xml:space="preserve">    codes </w:t>
+      </w:r>
+      <w:r>
+        <w:rPr>
+          <w:rStyle w:val="OperatorTok"/>
+        </w:rPr>
+        <w:t xml:space="preserve">=</w:t>
+      </w:r>
+      <w:r>
+        <w:rPr>
+          <w:rStyle w:val="NormalTok"/>
+        </w:rPr>
+        <w:t xml:space="preserve"> build_codes(left, prefix </w:t>
+      </w:r>
+      <w:r>
+        <w:rPr>
+          <w:rStyle w:val="OperatorTok"/>
+        </w:rPr>
+        <w:t xml:space="preserve">+</w:t>
+      </w:r>
+      <w:r>
+        <w:rPr>
+          <w:rStyle w:val="NormalTok"/>
+        </w:rPr>
+        <w:t xml:space="preserve"> </w:t>
+      </w:r>
+      <w:r>
+        <w:rPr>
+          <w:rStyle w:val="StringTok"/>
+        </w:rPr>
+        <w:t xml:space="preserve">"0"</w:t>
+      </w:r>
+      <w:r>
+        <w:rPr>
+          <w:rStyle w:val="NormalTok"/>
+        </w:rPr>
+        <w:t xml:space="preserve">)</w:t>
+      </w:r>
+      <w:r>
+        <w:br/>
+      </w:r>
+      <w:r>
+        <w:rPr>
+          <w:rStyle w:val="NormalTok"/>
+        </w:rPr>
+        <w:t xml:space="preserve">    codes.update(build_codes(right, prefix </w:t>
+      </w:r>
+      <w:r>
+        <w:rPr>
+          <w:rStyle w:val="OperatorTok"/>
+        </w:rPr>
+        <w:t xml:space="preserve">+</w:t>
+      </w:r>
+      <w:r>
+        <w:rPr>
+          <w:rStyle w:val="NormalTok"/>
+        </w:rPr>
+        <w:t xml:space="preserve"> </w:t>
+      </w:r>
+      <w:r>
+        <w:rPr>
+          <w:rStyle w:val="StringTok"/>
+        </w:rPr>
+        <w:t xml:space="preserve">"1"</w:t>
+      </w:r>
+      <w:r>
+        <w:rPr>
+          <w:rStyle w:val="NormalTok"/>
+        </w:rPr>
+        <w:t xml:space="preserve">))</w:t>
+      </w:r>
+      <w:r>
+        <w:br/>
+      </w:r>
+      <w:r>
+        <w:rPr>
+          <w:rStyle w:val="NormalTok"/>
+        </w:rPr>
+        <w:t xml:space="preserve">    </w:t>
+      </w:r>
+      <w:r>
+        <w:rPr>
+          <w:rStyle w:val="ControlFlowTok"/>
+        </w:rPr>
+        <w:t xml:space="preserve">return</w:t>
+      </w:r>
+      <w:r>
+        <w:rPr>
+          <w:rStyle w:val="NormalTok"/>
+        </w:rPr>
+        <w:t xml:space="preserve"> codes</w:t>
       </w:r>
     </w:p>
-    <w:bookmarkEnd w:id="12"/>
-    <w:bookmarkEnd w:id="13"/>
-    <w:bookmarkStart w:id="14" w:name="Xd66a2ab86cd796ea9f9a0dd382f7bf284114f84"/>
+    <w:bookmarkEnd w:id="20"/>
+    <w:bookmarkStart w:id="22" w:name="Xe4c5ddbff53726352ca353934e53402c1c518b4"/>
+    <w:bookmarkStart w:id="21" w:name="encode-and-decode"/>
     <w:p>
       <w:pPr>
-        <w:pStyle w:val="SourceCode"/>
-      </w:pPr>
-      <w:r>
-        <w:rPr>
-          <w:rStyle w:val="ImportTok"/>
-        </w:rPr>
-        <w:t xml:space="preserve">import</w:t>
-      </w:r>
-      <w:r>
-        <w:rPr>
-          <w:rStyle w:val="NormalTok"/>
-        </w:rPr>
-        <w:t xml:space="preserve"> heapq</w:t>
-      </w:r>
-    </w:p>
-    <w:bookmarkEnd w:id="14"/>
-    <w:bookmarkStart w:id="16" w:name="X9c24649383a4f6f5268b691df9146882df96d93"/>
-    <w:bookmarkStart w:id="15" w:name="build_tree--the-greedy-merging"/>
-    <w:p>
-      <w:pPr>
         <w:pStyle w:val="Heading3"/>
       </w:pPr>
       <w:r>
         <w:rPr>
           <w:rStyle w:val="VerbatimChar"/>
         </w:rPr>
-        <w:t xml:space="preserve">build_tree</w:t>
-      </w:r>
-      <w:r>
-        <w:t xml:space="preserve"> </w:t>
-      </w:r>
-      <w:r>
-        <w:t xml:space="preserve">— the greedy merging</w:t>
+        <w:t xml:space="preserve">encode</w:t>
+      </w:r>
+      <w:r>
+        <w:t xml:space="preserve"> </w:t>
+      </w:r>
+      <w:r>
+        <w:t xml:space="preserve">and</w:t>
+      </w:r>
+      <w:r>
+        <w:t xml:space="preserve"> </w:t>
+      </w:r>
+      <w:r>
+        <w:rPr>
+          <w:rStyle w:val="VerbatimChar"/>
+        </w:rPr>
+        <w:t xml:space="preserve">decode</w:t>
       </w:r>
     </w:p>
     <w:p>
@@ -405,19 +1328,17 @@
         </w:numPr>
       </w:pPr>
       <w:r>
-        <w:t xml:space="preserve">Start with one heap entry per character:</w:t>
-      </w:r>
-      <w:r>
-        <w:t xml:space="preserve"> </w:t>
-      </w:r>
-      <w:r>
-        <w:rPr>
-          <w:rStyle w:val="VerbatimChar"/>
-        </w:rPr>
-        <w:t xml:space="preserve">(frequency, tie-breaker, node)</w:t>
-      </w:r>
-      <w:r>
-        <w:t xml:space="preserve">.</w:t>
+        <w:rPr>
+          <w:b/>
+          <w:bCs/>
+        </w:rPr>
+        <w:t xml:space="preserve">Encode:</w:t>
+      </w:r>
+      <w:r>
+        <w:t xml:space="preserve"> </w:t>
+      </w:r>
+      <w:r>
+        <w:t xml:space="preserve">look up each character's code and glue them together into one bitstring.</w:t>
       </w:r>
     </w:p>
     <w:p>
@@ -429,1013 +1350,6 @@
         </w:numPr>
       </w:pPr>
       <w:r>
-        <w:t xml:space="preserve">A</w:t>
-      </w:r>
-      <w:r>
-        <w:t xml:space="preserve"> </w:t>
-      </w:r>
-      <w:r>
-        <w:rPr>
-          <w:b/>
-          <w:bCs/>
-        </w:rPr>
-        <w:t xml:space="preserve">node</w:t>
-      </w:r>
-      <w:r>
-        <w:t xml:space="preserve"> </w:t>
-      </w:r>
-      <w:r>
-        <w:t xml:space="preserve">is either a single character (a</w:t>
-      </w:r>
-      <w:r>
-        <w:t xml:space="preserve"> </w:t>
-      </w:r>
-      <w:r>
-        <w:rPr>
-          <w:i/>
-          <w:iCs/>
-        </w:rPr>
-        <w:t xml:space="preserve">leaf</w:t>
-      </w:r>
-      <w:r>
-        <w:t xml:space="preserve">) or a</w:t>
-      </w:r>
-      <w:r>
-        <w:t xml:space="preserve"> </w:t>
-      </w:r>
-      <w:r>
-        <w:rPr>
-          <w:rStyle w:val="VerbatimChar"/>
-        </w:rPr>
-        <w:t xml:space="preserve">(left, right)</w:t>
-      </w:r>
-      <w:r>
-        <w:t xml:space="preserve"> </w:t>
-      </w:r>
-      <w:r>
-        <w:t xml:space="preserve">pair (an</w:t>
-      </w:r>
-      <w:r>
-        <w:t xml:space="preserve"> </w:t>
-      </w:r>
-      <w:r>
-        <w:rPr>
-          <w:i/>
-          <w:iCs/>
-        </w:rPr>
-        <w:t xml:space="preserve">internal</w:t>
-      </w:r>
-      <w:r>
-        <w:t xml:space="preserve"> </w:t>
-      </w:r>
-      <w:r>
-        <w:t xml:space="preserve">node).</w:t>
-      </w:r>
-    </w:p>
-    <w:p>
-      <w:pPr>
-        <w:pStyle w:val="Compact"/>
-        <w:numPr>
-          <w:ilvl w:val="0"/>
-          <w:numId w:val="1002"/>
-        </w:numPr>
-      </w:pPr>
-      <w:r>
-        <w:t xml:space="preserve">Pop the two smallest, fuse them into a new node whose frequency is their</w:t>
-      </w:r>
-      <w:r>
-        <w:t xml:space="preserve"> </w:t>
-      </w:r>
-      <w:r>
-        <w:rPr>
-          <w:b/>
-          <w:bCs/>
-        </w:rPr>
-        <w:t xml:space="preserve">sum</w:t>
-      </w:r>
-      <w:r>
-        <w:t xml:space="preserve">, push it back.</w:t>
-      </w:r>
-    </w:p>
-    <w:p>
-      <w:pPr>
-        <w:pStyle w:val="Compact"/>
-        <w:numPr>
-          <w:ilvl w:val="0"/>
-          <w:numId w:val="1002"/>
-        </w:numPr>
-      </w:pPr>
-      <w:r>
-        <w:t xml:space="preserve">Repeat until a single node is left — that is the</w:t>
-      </w:r>
-      <w:r>
-        <w:t xml:space="preserve"> </w:t>
-      </w:r>
-      <w:r>
-        <w:rPr>
-          <w:b/>
-          <w:bCs/>
-        </w:rPr>
-        <w:t xml:space="preserve">root</w:t>
-      </w:r>
-      <w:r>
-        <w:t xml:space="preserve"> </w:t>
-      </w:r>
-      <w:r>
-        <w:t xml:space="preserve">of the Huffman tree.</w:t>
-      </w:r>
-    </w:p>
-    <w:p>
-      <w:pPr>
-        <w:pStyle w:val="FirstParagraph"/>
-      </w:pPr>
-      <w:r>
-        <w:t xml:space="preserve">The</w:t>
-      </w:r>
-      <w:r>
-        <w:t xml:space="preserve"> </w:t>
-      </w:r>
-      <w:r>
-        <w:rPr>
-          <w:rStyle w:val="VerbatimChar"/>
-        </w:rPr>
-        <w:t xml:space="preserve">counter</w:t>
-      </w:r>
-      <w:r>
-        <w:t xml:space="preserve"> </w:t>
-      </w:r>
-      <w:r>
-        <w:t xml:space="preserve">is only there to break ties deterministically when two frequencies are equal</w:t>
-      </w:r>
-      <w:r>
-        <w:t xml:space="preserve"> </w:t>
-      </w:r>
-      <w:r>
-        <w:t xml:space="preserve">(so Python never has to compare two</w:t>
-      </w:r>
-      <w:r>
-        <w:t xml:space="preserve"> </w:t>
-      </w:r>
-      <w:r>
-        <w:rPr>
-          <w:rStyle w:val="VerbatimChar"/>
-        </w:rPr>
-        <w:t xml:space="preserve">(left, right)</w:t>
-      </w:r>
-      <w:r>
-        <w:t xml:space="preserve"> </w:t>
-      </w:r>
-      <w:r>
-        <w:t xml:space="preserve">tuples).</w:t>
-      </w:r>
-    </w:p>
-    <w:bookmarkEnd w:id="15"/>
-    <w:bookmarkEnd w:id="16"/>
-    <w:bookmarkStart w:id="17" w:name="ae613168"/>
-    <w:p>
-      <w:pPr>
-        <w:pStyle w:val="SourceCode"/>
-      </w:pPr>
-      <w:r>
-        <w:rPr>
-          <w:rStyle w:val="KeywordTok"/>
-        </w:rPr>
-        <w:t xml:space="preserve">def</w:t>
-      </w:r>
-      <w:r>
-        <w:rPr>
-          <w:rStyle w:val="NormalTok"/>
-        </w:rPr>
-        <w:t xml:space="preserve"> build_tree(frequencies):</w:t>
-      </w:r>
-      <w:r>
-        <w:br/>
-      </w:r>
-      <w:r>
-        <w:rPr>
-          <w:rStyle w:val="NormalTok"/>
-        </w:rPr>
-        <w:t xml:space="preserve">    </w:t>
-      </w:r>
-      <w:r>
-        <w:rPr>
-          <w:rStyle w:val="CommentTok"/>
-        </w:rPr>
-        <w:t xml:space="preserve">"""Merge the two smallest frequencies until one node (the root) is left."""</w:t>
-      </w:r>
-      <w:r>
-        <w:br/>
-      </w:r>
-      <w:r>
-        <w:rPr>
-          <w:rStyle w:val="NormalTok"/>
-        </w:rPr>
-        <w:t xml:space="preserve">    heap </w:t>
-      </w:r>
-      <w:r>
-        <w:rPr>
-          <w:rStyle w:val="OperatorTok"/>
-        </w:rPr>
-        <w:t xml:space="preserve">=</w:t>
-      </w:r>
-      <w:r>
-        <w:rPr>
-          <w:rStyle w:val="NormalTok"/>
-        </w:rPr>
-        <w:t xml:space="preserve"> [(freq, i, char) </w:t>
-      </w:r>
-      <w:r>
-        <w:rPr>
-          <w:rStyle w:val="ControlFlowTok"/>
-        </w:rPr>
-        <w:t xml:space="preserve">for</w:t>
-      </w:r>
-      <w:r>
-        <w:rPr>
-          <w:rStyle w:val="NormalTok"/>
-        </w:rPr>
-        <w:t xml:space="preserve"> i, (char, freq) </w:t>
-      </w:r>
-      <w:r>
-        <w:rPr>
-          <w:rStyle w:val="KeywordTok"/>
-        </w:rPr>
-        <w:t xml:space="preserve">in</w:t>
-      </w:r>
-      <w:r>
-        <w:rPr>
-          <w:rStyle w:val="NormalTok"/>
-        </w:rPr>
-        <w:t xml:space="preserve"> </w:t>
-      </w:r>
-      <w:r>
-        <w:rPr>
-          <w:rStyle w:val="BuiltInTok"/>
-        </w:rPr>
-        <w:t xml:space="preserve">enumerate</w:t>
-      </w:r>
-      <w:r>
-        <w:rPr>
-          <w:rStyle w:val="NormalTok"/>
-        </w:rPr>
-        <w:t xml:space="preserve">(frequencies.items())]</w:t>
-      </w:r>
-      <w:r>
-        <w:br/>
-      </w:r>
-      <w:r>
-        <w:rPr>
-          <w:rStyle w:val="NormalTok"/>
-        </w:rPr>
-        <w:t xml:space="preserve">    heapq.heapify(heap)                          </w:t>
-      </w:r>
-      <w:r>
-        <w:rPr>
-          <w:rStyle w:val="CommentTok"/>
-        </w:rPr>
-        <w:t xml:space="preserve"># min-heap = priority queue</w:t>
-      </w:r>
-      <w:r>
-        <w:br/>
-      </w:r>
-      <w:r>
-        <w:rPr>
-          <w:rStyle w:val="NormalTok"/>
-        </w:rPr>
-        <w:t xml:space="preserve">    counter </w:t>
-      </w:r>
-      <w:r>
-        <w:rPr>
-          <w:rStyle w:val="OperatorTok"/>
-        </w:rPr>
-        <w:t xml:space="preserve">=</w:t>
-      </w:r>
-      <w:r>
-        <w:rPr>
-          <w:rStyle w:val="NormalTok"/>
-        </w:rPr>
-        <w:t xml:space="preserve"> </w:t>
-      </w:r>
-      <w:r>
-        <w:rPr>
-          <w:rStyle w:val="BuiltInTok"/>
-        </w:rPr>
-        <w:t xml:space="preserve">len</w:t>
-      </w:r>
-      <w:r>
-        <w:rPr>
-          <w:rStyle w:val="NormalTok"/>
-        </w:rPr>
-        <w:t xml:space="preserve">(heap)</w:t>
-      </w:r>
-      <w:r>
-        <w:br/>
-      </w:r>
-      <w:r>
-        <w:br/>
-      </w:r>
-      <w:r>
-        <w:rPr>
-          <w:rStyle w:val="NormalTok"/>
-        </w:rPr>
-        <w:t xml:space="preserve">    </w:t>
-      </w:r>
-      <w:r>
-        <w:rPr>
-          <w:rStyle w:val="ControlFlowTok"/>
-        </w:rPr>
-        <w:t xml:space="preserve">while</w:t>
-      </w:r>
-      <w:r>
-        <w:rPr>
-          <w:rStyle w:val="NormalTok"/>
-        </w:rPr>
-        <w:t xml:space="preserve"> </w:t>
-      </w:r>
-      <w:r>
-        <w:rPr>
-          <w:rStyle w:val="BuiltInTok"/>
-        </w:rPr>
-        <w:t xml:space="preserve">len</w:t>
-      </w:r>
-      <w:r>
-        <w:rPr>
-          <w:rStyle w:val="NormalTok"/>
-        </w:rPr>
-        <w:t xml:space="preserve">(heap) </w:t>
-      </w:r>
-      <w:r>
-        <w:rPr>
-          <w:rStyle w:val="OperatorTok"/>
-        </w:rPr>
-        <w:t xml:space="preserve">&gt;</w:t>
-      </w:r>
-      <w:r>
-        <w:rPr>
-          <w:rStyle w:val="NormalTok"/>
-        </w:rPr>
-        <w:t xml:space="preserve"> </w:t>
-      </w:r>
-      <w:r>
-        <w:rPr>
-          <w:rStyle w:val="DecValTok"/>
-        </w:rPr>
-        <w:t xml:space="preserve">1</w:t>
-      </w:r>
-      <w:r>
-        <w:rPr>
-          <w:rStyle w:val="NormalTok"/>
-        </w:rPr>
-        <w:t xml:space="preserve">:</w:t>
-      </w:r>
-      <w:r>
-        <w:br/>
-      </w:r>
-      <w:r>
-        <w:rPr>
-          <w:rStyle w:val="NormalTok"/>
-        </w:rPr>
-        <w:t xml:space="preserve">        freq_a, _, node_a </w:t>
-      </w:r>
-      <w:r>
-        <w:rPr>
-          <w:rStyle w:val="OperatorTok"/>
-        </w:rPr>
-        <w:t xml:space="preserve">=</w:t>
-      </w:r>
-      <w:r>
-        <w:rPr>
-          <w:rStyle w:val="NormalTok"/>
-        </w:rPr>
-        <w:t xml:space="preserve"> heapq.heappop(heap)  </w:t>
-      </w:r>
-      <w:r>
-        <w:rPr>
-          <w:rStyle w:val="CommentTok"/>
-        </w:rPr>
-        <w:t xml:space="preserve"># smallest</w:t>
-      </w:r>
-      <w:r>
-        <w:br/>
-      </w:r>
-      <w:r>
-        <w:rPr>
-          <w:rStyle w:val="NormalTok"/>
-        </w:rPr>
-        <w:t xml:space="preserve">        freq_b, _, node_b </w:t>
-      </w:r>
-      <w:r>
-        <w:rPr>
-          <w:rStyle w:val="OperatorTok"/>
-        </w:rPr>
-        <w:t xml:space="preserve">=</w:t>
-      </w:r>
-      <w:r>
-        <w:rPr>
-          <w:rStyle w:val="NormalTok"/>
-        </w:rPr>
-        <w:t xml:space="preserve"> heapq.heappop(heap)  </w:t>
-      </w:r>
-      <w:r>
-        <w:rPr>
-          <w:rStyle w:val="CommentTok"/>
-        </w:rPr>
-        <w:t xml:space="preserve"># second smallest</w:t>
-      </w:r>
-      <w:r>
-        <w:br/>
-      </w:r>
-      <w:r>
-        <w:rPr>
-          <w:rStyle w:val="NormalTok"/>
-        </w:rPr>
-        <w:t xml:space="preserve">        heapq.heappush(heap, (freq_a </w:t>
-      </w:r>
-      <w:r>
-        <w:rPr>
-          <w:rStyle w:val="OperatorTok"/>
-        </w:rPr>
-        <w:t xml:space="preserve">+</w:t>
-      </w:r>
-      <w:r>
-        <w:rPr>
-          <w:rStyle w:val="NormalTok"/>
-        </w:rPr>
-        <w:t xml:space="preserve"> freq_b, counter, (node_a, node_b)))</w:t>
-      </w:r>
-      <w:r>
-        <w:br/>
-      </w:r>
-      <w:r>
-        <w:rPr>
-          <w:rStyle w:val="NormalTok"/>
-        </w:rPr>
-        <w:t xml:space="preserve">        counter </w:t>
-      </w:r>
-      <w:r>
-        <w:rPr>
-          <w:rStyle w:val="OperatorTok"/>
-        </w:rPr>
-        <w:t xml:space="preserve">+=</w:t>
-      </w:r>
-      <w:r>
-        <w:rPr>
-          <w:rStyle w:val="NormalTok"/>
-        </w:rPr>
-        <w:t xml:space="preserve"> </w:t>
-      </w:r>
-      <w:r>
-        <w:rPr>
-          <w:rStyle w:val="DecValTok"/>
-        </w:rPr>
-        <w:t xml:space="preserve">1</w:t>
-      </w:r>
-      <w:r>
-        <w:br/>
-      </w:r>
-      <w:r>
-        <w:br/>
-      </w:r>
-      <w:r>
-        <w:rPr>
-          <w:rStyle w:val="NormalTok"/>
-        </w:rPr>
-        <w:t xml:space="preserve">    </w:t>
-      </w:r>
-      <w:r>
-        <w:rPr>
-          <w:rStyle w:val="ControlFlowTok"/>
-        </w:rPr>
-        <w:t xml:space="preserve">return</w:t>
-      </w:r>
-      <w:r>
-        <w:rPr>
-          <w:rStyle w:val="NormalTok"/>
-        </w:rPr>
-        <w:t xml:space="preserve"> heap[</w:t>
-      </w:r>
-      <w:r>
-        <w:rPr>
-          <w:rStyle w:val="DecValTok"/>
-        </w:rPr>
-        <w:t xml:space="preserve">0</w:t>
-      </w:r>
-      <w:r>
-        <w:rPr>
-          <w:rStyle w:val="NormalTok"/>
-        </w:rPr>
-        <w:t xml:space="preserve">][</w:t>
-      </w:r>
-      <w:r>
-        <w:rPr>
-          <w:rStyle w:val="DecValTok"/>
-        </w:rPr>
-        <w:t xml:space="preserve">2</w:t>
-      </w:r>
-      <w:r>
-        <w:rPr>
-          <w:rStyle w:val="NormalTok"/>
-        </w:rPr>
-        <w:t xml:space="preserve">]                            </w:t>
-      </w:r>
-      <w:r>
-        <w:rPr>
-          <w:rStyle w:val="CommentTok"/>
-        </w:rPr>
-        <w:t xml:space="preserve"># the root node</w:t>
-      </w:r>
-    </w:p>
-    <w:bookmarkEnd w:id="17"/>
-    <w:bookmarkStart w:id="19" w:name="fcf92a31"/>
-    <w:bookmarkStart w:id="18" w:name="build_codes--read-the-codes-off-the-tree"/>
-    <w:p>
-      <w:pPr>
-        <w:pStyle w:val="Heading3"/>
-      </w:pPr>
-      <w:r>
-        <w:rPr>
-          <w:rStyle w:val="VerbatimChar"/>
-        </w:rPr>
-        <w:t xml:space="preserve">build_codes</w:t>
-      </w:r>
-      <w:r>
-        <w:t xml:space="preserve"> </w:t>
-      </w:r>
-      <w:r>
-        <w:t xml:space="preserve">— read the codes off the tree</w:t>
-      </w:r>
-    </w:p>
-    <w:p>
-      <w:pPr>
-        <w:pStyle w:val="FirstParagraph"/>
-      </w:pPr>
-      <w:r>
-        <w:t xml:space="preserve">Walk down from the root.</w:t>
-      </w:r>
-      <w:r>
-        <w:t xml:space="preserve"> </w:t>
-      </w:r>
-      <w:r>
-        <w:rPr>
-          <w:b/>
-          <w:bCs/>
-        </w:rPr>
-        <w:t xml:space="preserve">Every left turn appends</w:t>
-      </w:r>
-      <w:r>
-        <w:rPr>
-          <w:b/>
-          <w:bCs/>
-        </w:rPr>
-        <w:t xml:space="preserve"> </w:t>
-      </w:r>
-      <w:r>
-        <w:rPr>
-          <w:rStyle w:val="VerbatimChar"/>
-          <w:b/>
-          <w:bCs/>
-        </w:rPr>
-        <w:t xml:space="preserve">0</w:t>
-      </w:r>
-      <w:r>
-        <w:rPr>
-          <w:b/>
-          <w:bCs/>
-        </w:rPr>
-        <w:t xml:space="preserve">, every right turn appends</w:t>
-      </w:r>
-      <w:r>
-        <w:rPr>
-          <w:b/>
-          <w:bCs/>
-        </w:rPr>
-        <w:t xml:space="preserve"> </w:t>
-      </w:r>
-      <w:r>
-        <w:rPr>
-          <w:rStyle w:val="VerbatimChar"/>
-          <w:b/>
-          <w:bCs/>
-        </w:rPr>
-        <w:t xml:space="preserve">1</w:t>
-      </w:r>
-      <w:r>
-        <w:rPr>
-          <w:b/>
-          <w:bCs/>
-        </w:rPr>
-        <w:t xml:space="preserve">.</w:t>
-      </w:r>
-      <w:r>
-        <w:t xml:space="preserve"> </w:t>
-      </w:r>
-      <w:r>
-        <w:t xml:space="preserve">When we reach a leaf (a</w:t>
-      </w:r>
-      <w:r>
-        <w:t xml:space="preserve"> </w:t>
-      </w:r>
-      <w:r>
-        <w:rPr>
-          <w:rStyle w:val="VerbatimChar"/>
-        </w:rPr>
-        <w:t xml:space="preserve">str</w:t>
-      </w:r>
-      <w:r>
-        <w:t xml:space="preserve">), the string we have accumulated</w:t>
-      </w:r>
-      <w:r>
-        <w:t xml:space="preserve"> </w:t>
-      </w:r>
-      <w:r>
-        <w:rPr>
-          <w:i/>
-          <w:iCs/>
-        </w:rPr>
-        <w:t xml:space="preserve">is</w:t>
-      </w:r>
-      <w:r>
-        <w:t xml:space="preserve"> </w:t>
-      </w:r>
-      <w:r>
-        <w:t xml:space="preserve">that character's code.</w:t>
-      </w:r>
-    </w:p>
-    <w:p>
-      <w:pPr>
-        <w:pStyle w:val="BodyText"/>
-      </w:pPr>
-      <w:r>
-        <w:t xml:space="preserve">Because characters live only at the leaves, no code is ever a</w:t>
-      </w:r>
-      <w:r>
-        <w:t xml:space="preserve"> </w:t>
-      </w:r>
-      <w:r>
-        <w:rPr>
-          <w:i/>
-          <w:iCs/>
-        </w:rPr>
-        <w:t xml:space="preserve">prefix</w:t>
-      </w:r>
-      <w:r>
-        <w:t xml:space="preserve"> </w:t>
-      </w:r>
-      <w:r>
-        <w:t xml:space="preserve">of another — this is a</w:t>
-      </w:r>
-      <w:r>
-        <w:t xml:space="preserve"> </w:t>
-      </w:r>
-      <w:r>
-        <w:rPr>
-          <w:b/>
-          <w:bCs/>
-        </w:rPr>
-        <w:t xml:space="preserve">prefix code</w:t>
-      </w:r>
-      <w:r>
-        <w:t xml:space="preserve">, which is exactly what lets the decoder work with no separators between codes.</w:t>
-      </w:r>
-    </w:p>
-    <w:bookmarkEnd w:id="18"/>
-    <w:bookmarkEnd w:id="19"/>
-    <w:bookmarkStart w:id="20" w:name="fbb8b5c5"/>
-    <w:p>
-      <w:pPr>
-        <w:pStyle w:val="SourceCode"/>
-      </w:pPr>
-      <w:r>
-        <w:rPr>
-          <w:rStyle w:val="KeywordTok"/>
-        </w:rPr>
-        <w:t xml:space="preserve">def</w:t>
-      </w:r>
-      <w:r>
-        <w:rPr>
-          <w:rStyle w:val="NormalTok"/>
-        </w:rPr>
-        <w:t xml:space="preserve"> build_codes(node, prefix</w:t>
-      </w:r>
-      <w:r>
-        <w:rPr>
-          <w:rStyle w:val="OperatorTok"/>
-        </w:rPr>
-        <w:t xml:space="preserve">=</w:t>
-      </w:r>
-      <w:r>
-        <w:rPr>
-          <w:rStyle w:val="StringTok"/>
-        </w:rPr>
-        <w:t xml:space="preserve">""</w:t>
-      </w:r>
-      <w:r>
-        <w:rPr>
-          <w:rStyle w:val="NormalTok"/>
-        </w:rPr>
-        <w:t xml:space="preserve">):</w:t>
-      </w:r>
-      <w:r>
-        <w:br/>
-      </w:r>
-      <w:r>
-        <w:rPr>
-          <w:rStyle w:val="NormalTok"/>
-        </w:rPr>
-        <w:t xml:space="preserve">    </w:t>
-      </w:r>
-      <w:r>
-        <w:rPr>
-          <w:rStyle w:val="CommentTok"/>
-        </w:rPr>
-        <w:t xml:space="preserve">"""Walk the tree: left adds '0', right adds '1'. Leaves hold the final code."""</w:t>
-      </w:r>
-      <w:r>
-        <w:br/>
-      </w:r>
-      <w:r>
-        <w:rPr>
-          <w:rStyle w:val="NormalTok"/>
-        </w:rPr>
-        <w:t xml:space="preserve">    </w:t>
-      </w:r>
-      <w:r>
-        <w:rPr>
-          <w:rStyle w:val="ControlFlowTok"/>
-        </w:rPr>
-        <w:t xml:space="preserve">if</w:t>
-      </w:r>
-      <w:r>
-        <w:rPr>
-          <w:rStyle w:val="NormalTok"/>
-        </w:rPr>
-        <w:t xml:space="preserve"> </w:t>
-      </w:r>
-      <w:r>
-        <w:rPr>
-          <w:rStyle w:val="BuiltInTok"/>
-        </w:rPr>
-        <w:t xml:space="preserve">isinstance</w:t>
-      </w:r>
-      <w:r>
-        <w:rPr>
-          <w:rStyle w:val="NormalTok"/>
-        </w:rPr>
-        <w:t xml:space="preserve">(node, </w:t>
-      </w:r>
-      <w:r>
-        <w:rPr>
-          <w:rStyle w:val="BuiltInTok"/>
-        </w:rPr>
-        <w:t xml:space="preserve">str</w:t>
-      </w:r>
-      <w:r>
-        <w:rPr>
-          <w:rStyle w:val="NormalTok"/>
-        </w:rPr>
-        <w:t xml:space="preserve">):                    </w:t>
-      </w:r>
-      <w:r>
-        <w:rPr>
-          <w:rStyle w:val="CommentTok"/>
-        </w:rPr>
-        <w:t xml:space="preserve"># a leaf -&gt; code is complete</w:t>
-      </w:r>
-      <w:r>
-        <w:br/>
-      </w:r>
-      <w:r>
-        <w:rPr>
-          <w:rStyle w:val="NormalTok"/>
-        </w:rPr>
-        <w:t xml:space="preserve">        </w:t>
-      </w:r>
-      <w:r>
-        <w:rPr>
-          <w:rStyle w:val="ControlFlowTok"/>
-        </w:rPr>
-        <w:t xml:space="preserve">return</w:t>
-      </w:r>
-      <w:r>
-        <w:rPr>
-          <w:rStyle w:val="NormalTok"/>
-        </w:rPr>
-        <w:t xml:space="preserve"> {node: prefix </w:t>
-      </w:r>
-      <w:r>
-        <w:rPr>
-          <w:rStyle w:val="KeywordTok"/>
-        </w:rPr>
-        <w:t xml:space="preserve">or</w:t>
-      </w:r>
-      <w:r>
-        <w:rPr>
-          <w:rStyle w:val="NormalTok"/>
-        </w:rPr>
-        <w:t xml:space="preserve"> </w:t>
-      </w:r>
-      <w:r>
-        <w:rPr>
-          <w:rStyle w:val="StringTok"/>
-        </w:rPr>
-        <w:t xml:space="preserve">"0"</w:t>
-      </w:r>
-      <w:r>
-        <w:rPr>
-          <w:rStyle w:val="NormalTok"/>
-        </w:rPr>
-        <w:t xml:space="preserve">}             </w:t>
-      </w:r>
-      <w:r>
-        <w:rPr>
-          <w:rStyle w:val="CommentTok"/>
-        </w:rPr>
-        <w:t xml:space="preserve"># 'or "0"' handles a 1-character alphabet</w:t>
-      </w:r>
-      <w:r>
-        <w:br/>
-      </w:r>
-      <w:r>
-        <w:br/>
-      </w:r>
-      <w:r>
-        <w:rPr>
-          <w:rStyle w:val="NormalTok"/>
-        </w:rPr>
-        <w:t xml:space="preserve">    left, right </w:t>
-      </w:r>
-      <w:r>
-        <w:rPr>
-          <w:rStyle w:val="OperatorTok"/>
-        </w:rPr>
-        <w:t xml:space="preserve">=</w:t>
-      </w:r>
-      <w:r>
-        <w:rPr>
-          <w:rStyle w:val="NormalTok"/>
-        </w:rPr>
-        <w:t xml:space="preserve"> node</w:t>
-      </w:r>
-      <w:r>
-        <w:br/>
-      </w:r>
-      <w:r>
-        <w:rPr>
-          <w:rStyle w:val="NormalTok"/>
-        </w:rPr>
-        <w:t xml:space="preserve">    codes </w:t>
-      </w:r>
-      <w:r>
-        <w:rPr>
-          <w:rStyle w:val="OperatorTok"/>
-        </w:rPr>
-        <w:t xml:space="preserve">=</w:t>
-      </w:r>
-      <w:r>
-        <w:rPr>
-          <w:rStyle w:val="NormalTok"/>
-        </w:rPr>
-        <w:t xml:space="preserve"> build_codes(left, prefix </w:t>
-      </w:r>
-      <w:r>
-        <w:rPr>
-          <w:rStyle w:val="OperatorTok"/>
-        </w:rPr>
-        <w:t xml:space="preserve">+</w:t>
-      </w:r>
-      <w:r>
-        <w:rPr>
-          <w:rStyle w:val="NormalTok"/>
-        </w:rPr>
-        <w:t xml:space="preserve"> </w:t>
-      </w:r>
-      <w:r>
-        <w:rPr>
-          <w:rStyle w:val="StringTok"/>
-        </w:rPr>
-        <w:t xml:space="preserve">"0"</w:t>
-      </w:r>
-      <w:r>
-        <w:rPr>
-          <w:rStyle w:val="NormalTok"/>
-        </w:rPr>
-        <w:t xml:space="preserve">)</w:t>
-      </w:r>
-      <w:r>
-        <w:br/>
-      </w:r>
-      <w:r>
-        <w:rPr>
-          <w:rStyle w:val="NormalTok"/>
-        </w:rPr>
-        <w:t xml:space="preserve">    codes.update(build_codes(right, prefix </w:t>
-      </w:r>
-      <w:r>
-        <w:rPr>
-          <w:rStyle w:val="OperatorTok"/>
-        </w:rPr>
-        <w:t xml:space="preserve">+</w:t>
-      </w:r>
-      <w:r>
-        <w:rPr>
-          <w:rStyle w:val="NormalTok"/>
-        </w:rPr>
-        <w:t xml:space="preserve"> </w:t>
-      </w:r>
-      <w:r>
-        <w:rPr>
-          <w:rStyle w:val="StringTok"/>
-        </w:rPr>
-        <w:t xml:space="preserve">"1"</w:t>
-      </w:r>
-      <w:r>
-        <w:rPr>
-          <w:rStyle w:val="NormalTok"/>
-        </w:rPr>
-        <w:t xml:space="preserve">))</w:t>
-      </w:r>
-      <w:r>
-        <w:br/>
-      </w:r>
-      <w:r>
-        <w:rPr>
-          <w:rStyle w:val="NormalTok"/>
-        </w:rPr>
-        <w:t xml:space="preserve">    </w:t>
-      </w:r>
-      <w:r>
-        <w:rPr>
-          <w:rStyle w:val="ControlFlowTok"/>
-        </w:rPr>
-        <w:t xml:space="preserve">return</w:t>
-      </w:r>
-      <w:r>
-        <w:rPr>
-          <w:rStyle w:val="NormalTok"/>
-        </w:rPr>
-        <w:t xml:space="preserve"> codes</w:t>
-      </w:r>
-    </w:p>
-    <w:bookmarkEnd w:id="20"/>
-    <w:bookmarkStart w:id="22" w:name="Xe4c5ddbff53726352ca353934e53402c1c518b4"/>
-    <w:bookmarkStart w:id="21" w:name="encode-and-decode"/>
-    <w:p>
-      <w:pPr>
-        <w:pStyle w:val="Heading3"/>
-      </w:pPr>
-      <w:r>
-        <w:rPr>
-          <w:rStyle w:val="VerbatimChar"/>
-        </w:rPr>
-        <w:t xml:space="preserve">encode</w:t>
-      </w:r>
-      <w:r>
-        <w:t xml:space="preserve"> </w:t>
-      </w:r>
-      <w:r>
-        <w:t xml:space="preserve">and</w:t>
-      </w:r>
-      <w:r>
-        <w:t xml:space="preserve"> </w:t>
-      </w:r>
-      <w:r>
-        <w:rPr>
-          <w:rStyle w:val="VerbatimChar"/>
-        </w:rPr>
-        <w:t xml:space="preserve">decode</w:t>
-      </w:r>
-    </w:p>
-    <w:p>
-      <w:pPr>
-        <w:pStyle w:val="Compact"/>
-        <w:numPr>
-          <w:ilvl w:val="0"/>
-          <w:numId w:val="1003"/>
-        </w:numPr>
-      </w:pPr>
-      <w:r>
-        <w:rPr>
-          <w:b/>
-          <w:bCs/>
-        </w:rPr>
-        <w:t xml:space="preserve">Encode:</w:t>
-      </w:r>
-      <w:r>
-        <w:t xml:space="preserve"> </w:t>
-      </w:r>
-      <w:r>
-        <w:t xml:space="preserve">look up each character's code and glue them together into one bitstring.</w:t>
-      </w:r>
-    </w:p>
-    <w:p>
-      <w:pPr>
-        <w:pStyle w:val="Compact"/>
-        <w:numPr>
-          <w:ilvl w:val="0"/>
-          <w:numId w:val="1003"/>
-        </w:numPr>
-      </w:pPr>
-      <w:r>
         <w:rPr>
           <w:b/>
           <w:bCs/>
@@ -1897,16 +1811,7 @@
       </w:r>
     </w:p>
     <w:bookmarkEnd w:id="23"/>
-    <w:bookmarkStart w:id="25" w:name="X06d0a497809dd7070fb012541924819667a7e87"/>
-    <w:bookmarkStart w:id="24" w:name="a-small-driver"/>
-    <w:p>
-      <w:pPr>
-        <w:pStyle w:val="Heading3"/>
-      </w:pPr>
-      <w:r>
-        <w:t xml:space="preserve">A small driver</w:t>
-      </w:r>
-    </w:p>
+    <w:bookmarkStart w:id="24" w:name="X06d0a497809dd7070fb012541924819667a7e87"/>
     <w:p>
       <w:pPr>
         <w:pStyle w:val="FirstParagraph"/>
@@ -1931,6 +1836,12 @@
       </w:r>
     </w:p>
     <w:bookmarkEnd w:id="24"/>
+    <w:bookmarkStart w:id="25" w:name="b0d54092"/>
+    <w:p>
+      <w:pPr>
+        <w:pStyle w:val="SourceCode"/>
+      </w:pPr>
+    </w:p>
     <w:bookmarkEnd w:id="25"/>
     <w:bookmarkStart w:id="26" w:name="X379dd7426e2a32e158d61238be5b96f83db1448"/>
     <w:p>
@@ -4707,7 +4618,7 @@
         <w:pStyle w:val="Compact"/>
         <w:numPr>
           <w:ilvl w:val="0"/>
-          <w:numId w:val="1004"/>
+          <w:numId w:val="1003"/>
         </w:numPr>
       </w:pPr>
       <w:r>
@@ -4738,7 +4649,7 @@
         <w:pStyle w:val="Compact"/>
         <w:numPr>
           <w:ilvl w:val="0"/>
-          <w:numId w:val="1004"/>
+          <w:numId w:val="1003"/>
         </w:numPr>
       </w:pPr>
       <w:r>
@@ -4766,7 +4677,7 @@
         <w:pStyle w:val="Compact"/>
         <w:numPr>
           <w:ilvl w:val="0"/>
-          <w:numId w:val="1004"/>
+          <w:numId w:val="1003"/>
         </w:numPr>
       </w:pPr>
       <w:r>
@@ -4956,91 +4867,6 @@
       </w:pPr>
     </w:lvl>
   </w:abstractNum>
-  <w:abstractNum w:abstractNumId="99201">
-    <w:nsid w:val="00A99201"/>
-    <w:multiLevelType w:val="multilevel"/>
-    <w:lvl w:ilvl="0">
-      <w:start w:val="1"/>
-      <w:numFmt w:val="decimal"/>
-      <w:lvlText w:val="%1."/>
-      <w:lvlJc w:val="left"/>
-      <w:pPr>
-        <w:ind w:left="720" w:hanging="360"/>
-      </w:pPr>
-    </w:lvl>
-    <w:lvl w:ilvl="1">
-      <w:start w:val="1"/>
-      <w:numFmt w:val="lowerLetter"/>
-      <w:lvlText w:val="%2."/>
-      <w:lvlJc w:val="left"/>
-      <w:pPr>
-        <w:ind w:left="1440" w:hanging="360"/>
-      </w:pPr>
-    </w:lvl>
-    <w:lvl w:ilvl="2">
-      <w:start w:val="1"/>
-      <w:numFmt w:val="lowerRoman"/>
-      <w:lvlText w:val="%3."/>
-      <w:lvlJc w:val="left"/>
-      <w:pPr>
-        <w:ind w:left="2160" w:hanging="360"/>
-      </w:pPr>
-    </w:lvl>
-    <w:lvl w:ilvl="3">
-      <w:start w:val="1"/>
-      <w:numFmt w:val="decimal"/>
-      <w:lvlText w:val="%4."/>
-      <w:lvlJc w:val="left"/>
-      <w:pPr>
-        <w:ind w:left="2880" w:hanging="360"/>
-      </w:pPr>
-    </w:lvl>
-    <w:lvl w:ilvl="4">
-      <w:start w:val="1"/>
-      <w:numFmt w:val="lowerLetter"/>
-      <w:lvlText w:val="%5."/>
-      <w:lvlJc w:val="left"/>
-      <w:pPr>
-        <w:ind w:left="3600" w:hanging="360"/>
-      </w:pPr>
-    </w:lvl>
-    <w:lvl w:ilvl="5">
-      <w:start w:val="1"/>
-      <w:numFmt w:val="lowerRoman"/>
-      <w:lvlText w:val="%6."/>
-      <w:lvlJc w:val="left"/>
-      <w:pPr>
-        <w:ind w:left="4320" w:hanging="360"/>
-      </w:pPr>
-    </w:lvl>
-    <w:lvl w:ilvl="6">
-      <w:start w:val="1"/>
-      <w:numFmt w:val="decimal"/>
-      <w:lvlText w:val="%7."/>
-      <w:lvlJc w:val="left"/>
-      <w:pPr>
-        <w:ind w:left="5040" w:hanging="360"/>
-      </w:pPr>
-    </w:lvl>
-    <w:lvl w:ilvl="7">
-      <w:start w:val="1"/>
-      <w:numFmt w:val="lowerLetter"/>
-      <w:lvlText w:val="%8."/>
-      <w:lvlJc w:val="left"/>
-      <w:pPr>
-        <w:ind w:left="5760" w:hanging="360"/>
-      </w:pPr>
-    </w:lvl>
-    <w:lvl w:ilvl="8">
-      <w:start w:val="1"/>
-      <w:numFmt w:val="lowerRoman"/>
-      <w:lvlText w:val="%9."/>
-      <w:lvlJc w:val="left"/>
-      <w:pPr>
-        <w:ind w:left="6480" w:hanging="360"/>
-      </w:pPr>
-    </w:lvl>
-  </w:abstractNum>
   <w:abstractNum w:abstractNumId="991">
     <w:nsid w:val="0000A991"/>
     <w:multiLevelType w:val="multilevel"/>
@@ -5148,42 +4974,12 @@
     <w:abstractNumId w:val="990"/>
   </w:num>
   <w:num w:numId="1001">
-    <w:abstractNumId w:val="99201"/>
-    <w:lvlOverride w:ilvl="0">
-      <w:startOverride w:val="1"/>
-    </w:lvlOverride>
-    <w:lvlOverride w:ilvl="1">
-      <w:startOverride w:val="1"/>
-    </w:lvlOverride>
-    <w:lvlOverride w:ilvl="2">
-      <w:startOverride w:val="1"/>
-    </w:lvlOverride>
-    <w:lvlOverride w:ilvl="3">
-      <w:startOverride w:val="1"/>
-    </w:lvlOverride>
-    <w:lvlOverride w:ilvl="4">
-      <w:startOverride w:val="1"/>
-    </w:lvlOverride>
-    <w:lvlOverride w:ilvl="5">
-      <w:startOverride w:val="1"/>
-    </w:lvlOverride>
-    <w:lvlOverride w:ilvl="6">
-      <w:startOverride w:val="1"/>
-    </w:lvlOverride>
-    <w:lvlOverride w:ilvl="7">
-      <w:startOverride w:val="1"/>
-    </w:lvlOverride>
-    <w:lvlOverride w:ilvl="8">
-      <w:startOverride w:val="1"/>
-    </w:lvlOverride>
+    <w:abstractNumId w:val="991"/>
   </w:num>
   <w:num w:numId="1002">
     <w:abstractNumId w:val="991"/>
   </w:num>
   <w:num w:numId="1003">
-    <w:abstractNumId w:val="991"/>
-  </w:num>
-  <w:num w:numId="1004">
     <w:abstractNumId w:val="991"/>
   </w:num>
 </w:numbering>

</xml_diff>

<commit_message>
Add the group members page and collect final Word docs
Every module notebook now opens with the group members. Filled in Module 4's
reflection answers and Module 9's FFT and pattern-matching summaries so both
match what their labs ask for. All five final Word docs live in final-submissions/.
</commit_message>
<xml_diff>
--- a/module-7-huffman-coding/module_7_huffman_coding.docx
+++ b/module-7-huffman-coding/module_7_huffman_coding.docx
@@ -2,8 +2,640 @@
 <file path=word/document.xml><?xml version="1.0" encoding="utf-8"?>
 <w:document xmlns:w="http://schemas.openxmlformats.org/wordprocessingml/2006/main" xmlns:m="http://schemas.openxmlformats.org/officeDocument/2006/math" xmlns:r="http://schemas.openxmlformats.org/officeDocument/2006/relationships" xmlns:o="urn:schemas-microsoft-com:office:office" xmlns:v="urn:schemas-microsoft-com:vml" xmlns:w10="urn:schemas-microsoft-com:office:word" xmlns:a="http://schemas.openxmlformats.org/drawingml/2006/main" xmlns:pic="http://schemas.openxmlformats.org/drawingml/2006/picture" xmlns:wp="http://schemas.openxmlformats.org/drawingml/2006/wordprocessingDrawing">
   <w:body>
-    <w:bookmarkStart w:id="11" w:name="e9d3a0ad"/>
-    <w:bookmarkStart w:id="10" w:name="huffman-coding--module-7-lab"/>
+    <w:bookmarkStart w:id="11" w:name="c9f69f76"/>
+    <w:bookmarkStart w:id="10" w:name="csc-821---group-1"/>
+    <w:p>
+      <w:pPr>
+        <w:pStyle w:val="Heading1"/>
+      </w:pPr>
+      <w:r>
+        <w:t xml:space="preserve">CSC 821 - Group 1</w:t>
+      </w:r>
+    </w:p>
+    <w:bookmarkStart w:id="9" w:name="group-members"/>
+    <w:p>
+      <w:pPr>
+        <w:pStyle w:val="Heading2"/>
+      </w:pPr>
+      <w:r>
+        <w:t xml:space="preserve">Group Members</w:t>
+      </w:r>
+    </w:p>
+    <w:tbl>
+      <w:tblPr>
+        <w:tblStyle w:val="Table"/>
+        <w:tblW w:type="auto" w:w="0"/>
+        <w:tblLook w:firstRow="1" w:lastRow="0" w:firstColumn="0" w:lastColumn="0" w:noHBand="0" w:noVBand="0" w:val="0020"/>
+      </w:tblPr>
+      <w:tblGrid>
+        <w:gridCol w:w="2640"/>
+        <w:gridCol w:w="2640"/>
+        <w:gridCol w:w="2640"/>
+      </w:tblGrid>
+      <w:tr>
+        <w:trPr>
+          <w:tblHeader w:val="on"/>
+        </w:trPr>
+        <w:tc>
+          <w:tcPr/>
+          <w:p>
+            <w:pPr>
+              <w:pStyle w:val="Compact"/>
+            </w:pPr>
+            <w:r>
+              <w:t xml:space="preserve">#</w:t>
+            </w:r>
+          </w:p>
+        </w:tc>
+        <w:tc>
+          <w:tcPr/>
+          <w:p>
+            <w:pPr>
+              <w:pStyle w:val="Compact"/>
+            </w:pPr>
+            <w:r>
+              <w:t xml:space="preserve">Name</w:t>
+            </w:r>
+          </w:p>
+        </w:tc>
+        <w:tc>
+          <w:tcPr/>
+          <w:p>
+            <w:pPr>
+              <w:pStyle w:val="Compact"/>
+            </w:pPr>
+            <w:r>
+              <w:t xml:space="preserve">Registration No.</w:t>
+            </w:r>
+          </w:p>
+        </w:tc>
+      </w:tr>
+      <w:tr>
+        <w:tc>
+          <w:tcPr/>
+          <w:p>
+            <w:pPr>
+              <w:pStyle w:val="Compact"/>
+            </w:pPr>
+            <w:r>
+              <w:t xml:space="preserve">1</w:t>
+            </w:r>
+          </w:p>
+        </w:tc>
+        <w:tc>
+          <w:tcPr/>
+          <w:p>
+            <w:pPr>
+              <w:pStyle w:val="Compact"/>
+            </w:pPr>
+            <w:r>
+              <w:t xml:space="preserve">Nyabuto Pharminous</w:t>
+            </w:r>
+          </w:p>
+        </w:tc>
+        <w:tc>
+          <w:tcPr/>
+          <w:p>
+            <w:pPr>
+              <w:pStyle w:val="Compact"/>
+            </w:pPr>
+            <w:r>
+              <w:t xml:space="preserve">ST62/56180/2025</w:t>
+            </w:r>
+          </w:p>
+        </w:tc>
+      </w:tr>
+      <w:tr>
+        <w:tc>
+          <w:tcPr/>
+          <w:p>
+            <w:pPr>
+              <w:pStyle w:val="Compact"/>
+            </w:pPr>
+            <w:r>
+              <w:t xml:space="preserve">2</w:t>
+            </w:r>
+          </w:p>
+        </w:tc>
+        <w:tc>
+          <w:tcPr/>
+          <w:p>
+            <w:pPr>
+              <w:pStyle w:val="Compact"/>
+            </w:pPr>
+            <w:r>
+              <w:t xml:space="preserve">Obed Munyao</w:t>
+            </w:r>
+          </w:p>
+        </w:tc>
+        <w:tc>
+          <w:tcPr/>
+          <w:p>
+            <w:pPr>
+              <w:pStyle w:val="Compact"/>
+            </w:pPr>
+            <w:r>
+              <w:t xml:space="preserve">ST62/61043/2025</w:t>
+            </w:r>
+          </w:p>
+        </w:tc>
+      </w:tr>
+      <w:tr>
+        <w:tc>
+          <w:tcPr/>
+          <w:p>
+            <w:pPr>
+              <w:pStyle w:val="Compact"/>
+            </w:pPr>
+            <w:r>
+              <w:t xml:space="preserve">3</w:t>
+            </w:r>
+          </w:p>
+        </w:tc>
+        <w:tc>
+          <w:tcPr/>
+          <w:p>
+            <w:pPr>
+              <w:pStyle w:val="Compact"/>
+            </w:pPr>
+            <w:r>
+              <w:t xml:space="preserve">Thomas Kibet Yebei</w:t>
+            </w:r>
+          </w:p>
+        </w:tc>
+        <w:tc>
+          <w:tcPr/>
+          <w:p>
+            <w:pPr>
+              <w:pStyle w:val="Compact"/>
+            </w:pPr>
+            <w:r>
+              <w:t xml:space="preserve">ST62/59650/2025</w:t>
+            </w:r>
+          </w:p>
+        </w:tc>
+      </w:tr>
+      <w:tr>
+        <w:tc>
+          <w:tcPr/>
+          <w:p>
+            <w:pPr>
+              <w:pStyle w:val="Compact"/>
+            </w:pPr>
+            <w:r>
+              <w:t xml:space="preserve">4</w:t>
+            </w:r>
+          </w:p>
+        </w:tc>
+        <w:tc>
+          <w:tcPr/>
+          <w:p>
+            <w:pPr>
+              <w:pStyle w:val="Compact"/>
+            </w:pPr>
+            <w:r>
+              <w:t xml:space="preserve">Ferdinand Atila Luvembe</w:t>
+            </w:r>
+          </w:p>
+        </w:tc>
+        <w:tc>
+          <w:tcPr/>
+          <w:p>
+            <w:pPr>
+              <w:pStyle w:val="Compact"/>
+            </w:pPr>
+            <w:r>
+              <w:t xml:space="preserve">ST62/60337/2025</w:t>
+            </w:r>
+          </w:p>
+        </w:tc>
+      </w:tr>
+      <w:tr>
+        <w:tc>
+          <w:tcPr/>
+          <w:p>
+            <w:pPr>
+              <w:pStyle w:val="Compact"/>
+            </w:pPr>
+            <w:r>
+              <w:t xml:space="preserve">5</w:t>
+            </w:r>
+          </w:p>
+        </w:tc>
+        <w:tc>
+          <w:tcPr/>
+          <w:p>
+            <w:pPr>
+              <w:pStyle w:val="Compact"/>
+            </w:pPr>
+            <w:r>
+              <w:t xml:space="preserve">Samson Wangila Wanyonyi</w:t>
+            </w:r>
+          </w:p>
+        </w:tc>
+        <w:tc>
+          <w:tcPr/>
+          <w:p>
+            <w:pPr>
+              <w:pStyle w:val="Compact"/>
+            </w:pPr>
+            <w:r>
+              <w:t xml:space="preserve">ST62/60771/2025</w:t>
+            </w:r>
+          </w:p>
+        </w:tc>
+      </w:tr>
+      <w:tr>
+        <w:tc>
+          <w:tcPr/>
+          <w:p>
+            <w:pPr>
+              <w:pStyle w:val="Compact"/>
+            </w:pPr>
+            <w:r>
+              <w:t xml:space="preserve">6</w:t>
+            </w:r>
+          </w:p>
+        </w:tc>
+        <w:tc>
+          <w:tcPr/>
+          <w:p>
+            <w:pPr>
+              <w:pStyle w:val="Compact"/>
+            </w:pPr>
+            <w:r>
+              <w:t xml:space="preserve">Thomas Kimani Miringu</w:t>
+            </w:r>
+          </w:p>
+        </w:tc>
+        <w:tc>
+          <w:tcPr/>
+          <w:p>
+            <w:pPr>
+              <w:pStyle w:val="Compact"/>
+            </w:pPr>
+            <w:r>
+              <w:t xml:space="preserve">ST62/61244/2025</w:t>
+            </w:r>
+          </w:p>
+        </w:tc>
+      </w:tr>
+      <w:tr>
+        <w:tc>
+          <w:tcPr/>
+          <w:p>
+            <w:pPr>
+              <w:pStyle w:val="Compact"/>
+            </w:pPr>
+            <w:r>
+              <w:t xml:space="preserve">7</w:t>
+            </w:r>
+          </w:p>
+        </w:tc>
+        <w:tc>
+          <w:tcPr/>
+          <w:p>
+            <w:pPr>
+              <w:pStyle w:val="Compact"/>
+            </w:pPr>
+            <w:r>
+              <w:t xml:space="preserve">Samuel Abuko Abuti</w:t>
+            </w:r>
+          </w:p>
+        </w:tc>
+        <w:tc>
+          <w:tcPr/>
+          <w:p>
+            <w:pPr>
+              <w:pStyle w:val="Compact"/>
+            </w:pPr>
+            <w:r>
+              <w:t xml:space="preserve">ST62/59655/2025</w:t>
+            </w:r>
+          </w:p>
+        </w:tc>
+      </w:tr>
+      <w:tr>
+        <w:tc>
+          <w:tcPr/>
+          <w:p>
+            <w:pPr>
+              <w:pStyle w:val="Compact"/>
+            </w:pPr>
+            <w:r>
+              <w:t xml:space="preserve">8</w:t>
+            </w:r>
+          </w:p>
+        </w:tc>
+        <w:tc>
+          <w:tcPr/>
+          <w:p>
+            <w:pPr>
+              <w:pStyle w:val="Compact"/>
+            </w:pPr>
+            <w:r>
+              <w:t xml:space="preserve">Githinji Lucy Njeri</w:t>
+            </w:r>
+          </w:p>
+        </w:tc>
+        <w:tc>
+          <w:tcPr/>
+          <w:p>
+            <w:pPr>
+              <w:pStyle w:val="Compact"/>
+            </w:pPr>
+            <w:r>
+              <w:t xml:space="preserve">ST62/60682/2025</w:t>
+            </w:r>
+          </w:p>
+        </w:tc>
+      </w:tr>
+      <w:tr>
+        <w:tc>
+          <w:tcPr/>
+          <w:p>
+            <w:pPr>
+              <w:pStyle w:val="Compact"/>
+            </w:pPr>
+            <w:r>
+              <w:t xml:space="preserve">9</w:t>
+            </w:r>
+          </w:p>
+        </w:tc>
+        <w:tc>
+          <w:tcPr/>
+          <w:p>
+            <w:pPr>
+              <w:pStyle w:val="Compact"/>
+            </w:pPr>
+            <w:r>
+              <w:t xml:space="preserve">Haron Samoei</w:t>
+            </w:r>
+          </w:p>
+        </w:tc>
+        <w:tc>
+          <w:tcPr/>
+          <w:p>
+            <w:pPr>
+              <w:pStyle w:val="Compact"/>
+            </w:pPr>
+            <w:r>
+              <w:t xml:space="preserve">ST62/60356/2025</w:t>
+            </w:r>
+          </w:p>
+        </w:tc>
+      </w:tr>
+      <w:tr>
+        <w:tc>
+          <w:tcPr/>
+          <w:p>
+            <w:pPr>
+              <w:pStyle w:val="Compact"/>
+            </w:pPr>
+            <w:r>
+              <w:t xml:space="preserve">10</w:t>
+            </w:r>
+          </w:p>
+        </w:tc>
+        <w:tc>
+          <w:tcPr/>
+          <w:p>
+            <w:pPr>
+              <w:pStyle w:val="Compact"/>
+            </w:pPr>
+            <w:r>
+              <w:t xml:space="preserve">Simon Mwangi Maina</w:t>
+            </w:r>
+          </w:p>
+        </w:tc>
+        <w:tc>
+          <w:tcPr/>
+          <w:p>
+            <w:pPr>
+              <w:pStyle w:val="Compact"/>
+            </w:pPr>
+            <w:r>
+              <w:t xml:space="preserve">ST62/61647/2025</w:t>
+            </w:r>
+          </w:p>
+        </w:tc>
+      </w:tr>
+      <w:tr>
+        <w:tc>
+          <w:tcPr/>
+          <w:p>
+            <w:pPr>
+              <w:pStyle w:val="Compact"/>
+            </w:pPr>
+            <w:r>
+              <w:t xml:space="preserve">11</w:t>
+            </w:r>
+          </w:p>
+        </w:tc>
+        <w:tc>
+          <w:tcPr/>
+          <w:p>
+            <w:pPr>
+              <w:pStyle w:val="Compact"/>
+            </w:pPr>
+            <w:r>
+              <w:t xml:space="preserve">Brian Cheruiyot</w:t>
+            </w:r>
+          </w:p>
+        </w:tc>
+        <w:tc>
+          <w:tcPr/>
+          <w:p>
+            <w:pPr>
+              <w:pStyle w:val="Compact"/>
+            </w:pPr>
+            <w:r>
+              <w:t xml:space="preserve">ST62/61027/2025</w:t>
+            </w:r>
+          </w:p>
+        </w:tc>
+      </w:tr>
+      <w:tr>
+        <w:tc>
+          <w:tcPr/>
+          <w:p>
+            <w:pPr>
+              <w:pStyle w:val="Compact"/>
+            </w:pPr>
+            <w:r>
+              <w:t xml:space="preserve">12</w:t>
+            </w:r>
+          </w:p>
+        </w:tc>
+        <w:tc>
+          <w:tcPr/>
+          <w:p>
+            <w:pPr>
+              <w:pStyle w:val="Compact"/>
+            </w:pPr>
+            <w:r>
+              <w:t xml:space="preserve">Susan Wambui</w:t>
+            </w:r>
+          </w:p>
+        </w:tc>
+        <w:tc>
+          <w:tcPr/>
+          <w:p>
+            <w:pPr>
+              <w:pStyle w:val="Compact"/>
+            </w:pPr>
+            <w:r>
+              <w:t xml:space="preserve">ST62/60422/2025</w:t>
+            </w:r>
+          </w:p>
+        </w:tc>
+      </w:tr>
+      <w:tr>
+        <w:tc>
+          <w:tcPr/>
+          <w:p>
+            <w:pPr>
+              <w:pStyle w:val="Compact"/>
+            </w:pPr>
+            <w:r>
+              <w:t xml:space="preserve">13</w:t>
+            </w:r>
+          </w:p>
+        </w:tc>
+        <w:tc>
+          <w:tcPr/>
+          <w:p>
+            <w:pPr>
+              <w:pStyle w:val="Compact"/>
+            </w:pPr>
+            <w:r>
+              <w:t xml:space="preserve">Awello Kanyandong Kevins</w:t>
+            </w:r>
+          </w:p>
+        </w:tc>
+        <w:tc>
+          <w:tcPr/>
+          <w:p>
+            <w:pPr>
+              <w:pStyle w:val="Compact"/>
+            </w:pPr>
+            <w:r>
+              <w:t xml:space="preserve">ST62/61033/2025</w:t>
+            </w:r>
+          </w:p>
+        </w:tc>
+      </w:tr>
+      <w:tr>
+        <w:tc>
+          <w:tcPr/>
+          <w:p>
+            <w:pPr>
+              <w:pStyle w:val="Compact"/>
+            </w:pPr>
+            <w:r>
+              <w:t xml:space="preserve">14</w:t>
+            </w:r>
+          </w:p>
+        </w:tc>
+        <w:tc>
+          <w:tcPr/>
+          <w:p>
+            <w:pPr>
+              <w:pStyle w:val="Compact"/>
+            </w:pPr>
+            <w:r>
+              <w:t xml:space="preserve">Patrick Mwangi Wanjiru</w:t>
+            </w:r>
+          </w:p>
+        </w:tc>
+        <w:tc>
+          <w:tcPr/>
+          <w:p>
+            <w:pPr>
+              <w:pStyle w:val="Compact"/>
+            </w:pPr>
+            <w:r>
+              <w:t xml:space="preserve">ST62/59698/2025</w:t>
+            </w:r>
+          </w:p>
+        </w:tc>
+      </w:tr>
+      <w:tr>
+        <w:tc>
+          <w:tcPr/>
+          <w:p>
+            <w:pPr>
+              <w:pStyle w:val="Compact"/>
+            </w:pPr>
+            <w:r>
+              <w:t xml:space="preserve">15</w:t>
+            </w:r>
+          </w:p>
+        </w:tc>
+        <w:tc>
+          <w:tcPr/>
+          <w:p>
+            <w:pPr>
+              <w:pStyle w:val="Compact"/>
+            </w:pPr>
+            <w:r>
+              <w:t xml:space="preserve">Stephen Mwangi Mumbi</w:t>
+            </w:r>
+          </w:p>
+        </w:tc>
+        <w:tc>
+          <w:tcPr/>
+          <w:p>
+            <w:pPr>
+              <w:pStyle w:val="Compact"/>
+            </w:pPr>
+            <w:r>
+              <w:t xml:space="preserve">ST62/59653/2025</w:t>
+            </w:r>
+          </w:p>
+        </w:tc>
+      </w:tr>
+      <w:tr>
+        <w:tc>
+          <w:tcPr/>
+          <w:p>
+            <w:pPr>
+              <w:pStyle w:val="Compact"/>
+            </w:pPr>
+            <w:r>
+              <w:t xml:space="preserve">16</w:t>
+            </w:r>
+          </w:p>
+        </w:tc>
+        <w:tc>
+          <w:tcPr/>
+          <w:p>
+            <w:pPr>
+              <w:pStyle w:val="Compact"/>
+            </w:pPr>
+            <w:r>
+              <w:t xml:space="preserve">Abisagy Nafula Wanyonyi</w:t>
+            </w:r>
+          </w:p>
+        </w:tc>
+        <w:tc>
+          <w:tcPr/>
+          <w:p>
+            <w:pPr>
+              <w:pStyle w:val="Compact"/>
+            </w:pPr>
+            <w:r>
+              <w:t xml:space="preserve">ST62/56881/2025</w:t>
+            </w:r>
+          </w:p>
+        </w:tc>
+      </w:tr>
+    </w:tbl>
+    <w:bookmarkEnd w:id="9"/>
+    <w:bookmarkEnd w:id="10"/>
+    <w:bookmarkEnd w:id="11"/>
+    <w:bookmarkStart w:id="14" w:name="e9d3a0ad"/>
+    <w:bookmarkStart w:id="13" w:name="huffman-coding--module-7-lab"/>
     <w:p>
       <w:pPr>
         <w:pStyle w:val="Heading1"/>
@@ -69,7 +701,7 @@
         </w:pict>
       </w:r>
     </w:p>
-    <w:bookmarkStart w:id="9" w:name="objective"/>
+    <w:bookmarkStart w:id="12" w:name="objective"/>
     <w:p>
       <w:pPr>
         <w:pStyle w:val="Heading2"/>
@@ -176,66 +808,66 @@
       </w:r>
       <w:r>
         <w:t xml:space="preserve">choice is provably optimal.</w:t>
-      </w:r>
-    </w:p>
-    <w:bookmarkEnd w:id="9"/>
-    <w:bookmarkEnd w:id="10"/>
-    <w:bookmarkEnd w:id="11"/>
-    <w:bookmarkStart w:id="13" w:name="eb38c0a8"/>
-    <w:bookmarkStart w:id="12" w:name="X22514214fe50d93d5ed646dd8cc770427058a02"/>
-    <w:p>
-      <w:pPr>
-        <w:pStyle w:val="Heading2"/>
-      </w:pPr>
-      <w:r>
-        <w:t xml:space="preserve">1. The greedy idea</w:t>
-      </w:r>
-    </w:p>
-    <w:p>
-      <w:pPr>
-        <w:pStyle w:val="FirstParagraph"/>
-      </w:pPr>
-      <w:r>
-        <w:t xml:space="preserve">The main idea is characters that appear more often should get shorter codes, while characters that appear less often can have longer codes. This saves space because the common characters are used more frequently.</w:t>
-      </w:r>
-    </w:p>
-    <w:p>
-      <w:pPr>
-        <w:pStyle w:val="BodyText"/>
-      </w:pPr>
-      <w:r>
-        <w:t xml:space="preserve">To make this happen, we repeatedly combine the two characters or groups with the smallest frequencies. The rare characters get combined first, which pushes them further down the tree and gives them longer codes. The more common characters are combined later, so they stay closer to the top and get shorter codes.</w:t>
-      </w:r>
-    </w:p>
-    <w:p>
-      <w:pPr>
-        <w:pStyle w:val="BodyText"/>
-      </w:pPr>
-      <w:r>
-        <w:t xml:space="preserve">A min-heap (priority queue) makes this process efficient because it lets us quickly find the two smallest frequencies. Each time we remove an item from the heap, the operation takes</w:t>
-      </w:r>
-      <w:r>
-        <w:t xml:space="preserve"> </w:t>
-      </w:r>
-      <w:r>
-        <w:rPr>
-          <w:b/>
-          <w:bCs/>
-        </w:rPr>
-        <w:t xml:space="preserve">O(log n)</w:t>
-      </w:r>
-      <w:r>
-        <w:t xml:space="preserve"> </w:t>
-      </w:r>
-      <w:r>
-        <w:t xml:space="preserve">time.</w:t>
       </w:r>
     </w:p>
     <w:bookmarkEnd w:id="12"/>
     <w:bookmarkEnd w:id="13"/>
-    <w:bookmarkStart w:id="14" w:name="Xd66a2ab86cd796ea9f9a0dd382f7bf284114f84"/>
+    <w:bookmarkEnd w:id="14"/>
+    <w:bookmarkStart w:id="16" w:name="eb38c0a8"/>
+    <w:bookmarkStart w:id="15" w:name="X22514214fe50d93d5ed646dd8cc770427058a02"/>
     <w:p>
       <w:pPr>
+        <w:pStyle w:val="Heading2"/>
+      </w:pPr>
+      <w:r>
+        <w:t xml:space="preserve">1. The greedy idea</w:t>
+      </w:r>
+    </w:p>
+    <w:p>
+      <w:pPr>
+        <w:pStyle w:val="FirstParagraph"/>
+      </w:pPr>
+      <w:r>
+        <w:t xml:space="preserve">The main idea is characters that appear more often should get shorter codes, while characters that appear less often can have longer codes. This saves space because the common characters are used more frequently.</w:t>
+      </w:r>
+    </w:p>
+    <w:p>
+      <w:pPr>
+        <w:pStyle w:val="BodyText"/>
+      </w:pPr>
+      <w:r>
+        <w:t xml:space="preserve">To make this happen, we repeatedly combine the two characters or groups with the smallest frequencies. The rare characters get combined first, which pushes them further down the tree and gives them longer codes. The more common characters are combined later, so they stay closer to the top and get shorter codes.</w:t>
+      </w:r>
+    </w:p>
+    <w:p>
+      <w:pPr>
+        <w:pStyle w:val="BodyText"/>
+      </w:pPr>
+      <w:r>
+        <w:t xml:space="preserve">A min-heap (priority queue) makes this process efficient because it lets us quickly find the two smallest frequencies. Each time we remove an item from the heap, the operation takes</w:t>
+      </w:r>
+      <w:r>
+        <w:t xml:space="preserve"> </w:t>
+      </w:r>
+      <w:r>
+        <w:rPr>
+          <w:b/>
+          <w:bCs/>
+        </w:rPr>
+        <w:t xml:space="preserve">O(log n)</w:t>
+      </w:r>
+      <w:r>
+        <w:t xml:space="preserve"> </w:t>
+      </w:r>
+      <w:r>
+        <w:t xml:space="preserve">time.</w:t>
+      </w:r>
+    </w:p>
+    <w:bookmarkEnd w:id="15"/>
+    <w:bookmarkEnd w:id="16"/>
+    <w:bookmarkStart w:id="17" w:name="Xd66a2ab86cd796ea9f9a0dd382f7bf284114f84"/>
+    <w:p>
+      <w:pPr>
         <w:pStyle w:val="SourceCode"/>
       </w:pPr>
       <w:r>
@@ -272,9 +904,9 @@
         <w:t xml:space="preserve"># which is how we keep pulling the two lowest-frequency nodes to merge</w:t>
       </w:r>
     </w:p>
-    <w:bookmarkEnd w:id="14"/>
-    <w:bookmarkStart w:id="16" w:name="X9c24649383a4f6f5268b691df9146882df96d93"/>
-    <w:bookmarkStart w:id="15" w:name="build_tree--the-greedy-merging"/>
+    <w:bookmarkEnd w:id="17"/>
+    <w:bookmarkStart w:id="19" w:name="X9c24649383a4f6f5268b691df9146882df96d93"/>
+    <w:bookmarkStart w:id="18" w:name="build_tree--the-greedy-merging"/>
     <w:p>
       <w:pPr>
         <w:pStyle w:val="Heading3"/>
@@ -485,9 +1117,9 @@
         <w:t xml:space="preserve">tuples).</w:t>
       </w:r>
     </w:p>
-    <w:bookmarkEnd w:id="15"/>
-    <w:bookmarkEnd w:id="16"/>
-    <w:bookmarkStart w:id="17" w:name="ae613168"/>
+    <w:bookmarkEnd w:id="18"/>
+    <w:bookmarkEnd w:id="19"/>
+    <w:bookmarkStart w:id="20" w:name="ae613168"/>
     <w:p>
       <w:pPr>
         <w:pStyle w:val="SourceCode"/>
@@ -841,9 +1473,9 @@
         <w:t xml:space="preserve"># the root node</w:t>
       </w:r>
     </w:p>
-    <w:bookmarkEnd w:id="17"/>
-    <w:bookmarkStart w:id="19" w:name="fcf92a31"/>
-    <w:bookmarkStart w:id="18" w:name="build_codes--read-the-codes-off-the-tree"/>
+    <w:bookmarkEnd w:id="20"/>
+    <w:bookmarkStart w:id="22" w:name="fcf92a31"/>
+    <w:bookmarkStart w:id="21" w:name="build_codes--read-the-codes-off-the-tree"/>
     <w:p>
       <w:pPr>
         <w:pStyle w:val="Heading3"/>
@@ -994,9 +1626,9 @@
         <w:t xml:space="preserve">, which is exactly what lets the decoder work with no separators between codes.</w:t>
       </w:r>
     </w:p>
-    <w:bookmarkEnd w:id="18"/>
-    <w:bookmarkEnd w:id="19"/>
-    <w:bookmarkStart w:id="20" w:name="fbb8b5c5"/>
+    <w:bookmarkEnd w:id="21"/>
+    <w:bookmarkEnd w:id="22"/>
+    <w:bookmarkStart w:id="23" w:name="fbb8b5c5"/>
     <w:p>
       <w:pPr>
         <w:pStyle w:val="SourceCode"/>
@@ -1290,9 +1922,9 @@
         <w:t xml:space="preserve"> codes</w:t>
       </w:r>
     </w:p>
-    <w:bookmarkEnd w:id="20"/>
-    <w:bookmarkStart w:id="22" w:name="Xe4c5ddbff53726352ca353934e53402c1c518b4"/>
-    <w:bookmarkStart w:id="21" w:name="encode-and-decode"/>
+    <w:bookmarkEnd w:id="23"/>
+    <w:bookmarkStart w:id="25" w:name="Xe4c5ddbff53726352ca353934e53402c1c518b4"/>
+    <w:bookmarkStart w:id="24" w:name="encode-and-decode"/>
     <w:p>
       <w:pPr>
         <w:pStyle w:val="Heading3"/>
@@ -1415,9 +2047,9 @@
         <w:t xml:space="preserve">property guarantees the decoder always knows where one code ends and the next begins.</w:t>
       </w:r>
     </w:p>
-    <w:bookmarkEnd w:id="21"/>
-    <w:bookmarkEnd w:id="22"/>
-    <w:bookmarkStart w:id="23" w:name="X3d88a3701de36fc3e96df1d2d6caf3b84f24769"/>
+    <w:bookmarkEnd w:id="24"/>
+    <w:bookmarkEnd w:id="25"/>
+    <w:bookmarkStart w:id="26" w:name="X3d88a3701de36fc3e96df1d2d6caf3b84f24769"/>
     <w:p>
       <w:pPr>
         <w:pStyle w:val="SourceCode"/>
@@ -1808,755 +2440,755 @@
           <w:rStyle w:val="NormalTok"/>
         </w:rPr>
         <w:t xml:space="preserve">.join(text)</w:t>
-      </w:r>
-    </w:p>
-    <w:bookmarkEnd w:id="23"/>
-    <w:bookmarkStart w:id="24" w:name="X06d0a497809dd7070fb012541924819667a7e87"/>
-    <w:p>
-      <w:pPr>
-        <w:pStyle w:val="FirstParagraph"/>
-      </w:pPr>
-      <w:r>
-        <w:rPr>
-          <w:rStyle w:val="VerbatimChar"/>
-        </w:rPr>
-        <w:t xml:space="preserve">run</w:t>
-      </w:r>
-      <w:r>
-        <w:t xml:space="preserve"> </w:t>
-      </w:r>
-      <w:r>
-        <w:t xml:space="preserve">ties it together: build the tree, read off the codes, print the code table, then encode and</w:t>
-      </w:r>
-      <w:r>
-        <w:t xml:space="preserve"> </w:t>
-      </w:r>
-      <w:r>
-        <w:t xml:space="preserve">decode a message (and confirm the round-trip is lossless).</w:t>
-      </w:r>
-    </w:p>
-    <w:bookmarkEnd w:id="24"/>
-    <w:bookmarkStart w:id="25" w:name="b0d54092"/>
-    <w:p>
-      <w:pPr>
-        <w:pStyle w:val="SourceCode"/>
-      </w:pPr>
-    </w:p>
-    <w:bookmarkEnd w:id="25"/>
-    <w:bookmarkStart w:id="26" w:name="X379dd7426e2a32e158d61238be5b96f83db1448"/>
-    <w:p>
-      <w:pPr>
-        <w:pStyle w:val="SourceCode"/>
-      </w:pPr>
-      <w:r>
-        <w:rPr>
-          <w:rStyle w:val="KeywordTok"/>
-        </w:rPr>
-        <w:t xml:space="preserve">def</w:t>
-      </w:r>
-      <w:r>
-        <w:rPr>
-          <w:rStyle w:val="NormalTok"/>
-        </w:rPr>
-        <w:t xml:space="preserve"> run(frequencies, text):</w:t>
-      </w:r>
-      <w:r>
-        <w:br/>
-      </w:r>
-      <w:r>
-        <w:rPr>
-          <w:rStyle w:val="NormalTok"/>
-        </w:rPr>
-        <w:t xml:space="preserve">    </w:t>
-      </w:r>
-      <w:r>
-        <w:rPr>
-          <w:rStyle w:val="CommentTok"/>
-        </w:rPr>
-        <w:t xml:space="preserve">"""Build codes for these frequencies, then encode and decode text."""</w:t>
-      </w:r>
-      <w:r>
-        <w:br/>
-      </w:r>
-      <w:r>
-        <w:rPr>
-          <w:rStyle w:val="NormalTok"/>
-        </w:rPr>
-        <w:t xml:space="preserve">    root </w:t>
-      </w:r>
-      <w:r>
-        <w:rPr>
-          <w:rStyle w:val="OperatorTok"/>
-        </w:rPr>
-        <w:t xml:space="preserve">=</w:t>
-      </w:r>
-      <w:r>
-        <w:rPr>
-          <w:rStyle w:val="NormalTok"/>
-        </w:rPr>
-        <w:t xml:space="preserve"> build_tree(frequencies)</w:t>
-      </w:r>
-      <w:r>
-        <w:br/>
-      </w:r>
-      <w:r>
-        <w:rPr>
-          <w:rStyle w:val="NormalTok"/>
-        </w:rPr>
-        <w:t xml:space="preserve">    codes </w:t>
-      </w:r>
-      <w:r>
-        <w:rPr>
-          <w:rStyle w:val="OperatorTok"/>
-        </w:rPr>
-        <w:t xml:space="preserve">=</w:t>
-      </w:r>
-      <w:r>
-        <w:rPr>
-          <w:rStyle w:val="NormalTok"/>
-        </w:rPr>
-        <w:t xml:space="preserve"> build_codes(root)</w:t>
-      </w:r>
-      <w:r>
-        <w:br/>
-      </w:r>
-      <w:r>
-        <w:br/>
-      </w:r>
-      <w:r>
-        <w:rPr>
-          <w:rStyle w:val="NormalTok"/>
-        </w:rPr>
-        <w:t xml:space="preserve">    </w:t>
-      </w:r>
-      <w:r>
-        <w:rPr>
-          <w:rStyle w:val="BuiltInTok"/>
-        </w:rPr>
-        <w:t xml:space="preserve">print</w:t>
-      </w:r>
-      <w:r>
-        <w:rPr>
-          <w:rStyle w:val="NormalTok"/>
-        </w:rPr>
-        <w:t xml:space="preserve">(</w:t>
-      </w:r>
-      <w:r>
-        <w:rPr>
-          <w:rStyle w:val="SpecialStringTok"/>
-        </w:rPr>
-        <w:t xml:space="preserve">f"</w:t>
-      </w:r>
-      <w:r>
-        <w:rPr>
-          <w:rStyle w:val="SpecialCharTok"/>
-        </w:rPr>
-        <w:t xml:space="preserve">{</w:t>
-      </w:r>
-      <w:r>
-        <w:rPr>
-          <w:rStyle w:val="StringTok"/>
-        </w:rPr>
-        <w:t xml:space="preserve">'char'</w:t>
-      </w:r>
-      <w:r>
-        <w:rPr>
-          <w:rStyle w:val="SpecialCharTok"/>
-        </w:rPr>
-        <w:t xml:space="preserve">:&lt;6}{</w:t>
-      </w:r>
-      <w:r>
-        <w:rPr>
-          <w:rStyle w:val="StringTok"/>
-        </w:rPr>
-        <w:t xml:space="preserve">'freq'</w:t>
-      </w:r>
-      <w:r>
-        <w:rPr>
-          <w:rStyle w:val="SpecialCharTok"/>
-        </w:rPr>
-        <w:t xml:space="preserve">:&gt;6}{</w:t>
-      </w:r>
-      <w:r>
-        <w:rPr>
-          <w:rStyle w:val="StringTok"/>
-        </w:rPr>
-        <w:t xml:space="preserve">'code'</w:t>
-      </w:r>
-      <w:r>
-        <w:rPr>
-          <w:rStyle w:val="SpecialCharTok"/>
-        </w:rPr>
-        <w:t xml:space="preserve">:&gt;8}</w:t>
-      </w:r>
-      <w:r>
-        <w:rPr>
-          <w:rStyle w:val="SpecialStringTok"/>
-        </w:rPr>
-        <w:t xml:space="preserve">"</w:t>
-      </w:r>
-      <w:r>
-        <w:rPr>
-          <w:rStyle w:val="NormalTok"/>
-        </w:rPr>
-        <w:t xml:space="preserve">)</w:t>
-      </w:r>
-      <w:r>
-        <w:br/>
-      </w:r>
-      <w:r>
-        <w:rPr>
-          <w:rStyle w:val="NormalTok"/>
-        </w:rPr>
-        <w:t xml:space="preserve">    </w:t>
-      </w:r>
-      <w:r>
-        <w:rPr>
-          <w:rStyle w:val="ControlFlowTok"/>
-        </w:rPr>
-        <w:t xml:space="preserve">for</w:t>
-      </w:r>
-      <w:r>
-        <w:rPr>
-          <w:rStyle w:val="NormalTok"/>
-        </w:rPr>
-        <w:t xml:space="preserve"> char </w:t>
-      </w:r>
-      <w:r>
-        <w:rPr>
-          <w:rStyle w:val="KeywordTok"/>
-        </w:rPr>
-        <w:t xml:space="preserve">in</w:t>
-      </w:r>
-      <w:r>
-        <w:rPr>
-          <w:rStyle w:val="NormalTok"/>
-        </w:rPr>
-        <w:t xml:space="preserve"> </w:t>
-      </w:r>
-      <w:r>
-        <w:rPr>
-          <w:rStyle w:val="BuiltInTok"/>
-        </w:rPr>
-        <w:t xml:space="preserve">sorted</w:t>
-      </w:r>
-      <w:r>
-        <w:rPr>
-          <w:rStyle w:val="NormalTok"/>
-        </w:rPr>
-        <w:t xml:space="preserve">(codes, key</w:t>
-      </w:r>
-      <w:r>
-        <w:rPr>
-          <w:rStyle w:val="OperatorTok"/>
-        </w:rPr>
-        <w:t xml:space="preserve">=</w:t>
-      </w:r>
-      <w:r>
-        <w:rPr>
-          <w:rStyle w:val="KeywordTok"/>
-        </w:rPr>
-        <w:t xml:space="preserve">lambda</w:t>
-      </w:r>
-      <w:r>
-        <w:rPr>
-          <w:rStyle w:val="NormalTok"/>
-        </w:rPr>
-        <w:t xml:space="preserve"> c: frequencies[c]):</w:t>
-      </w:r>
-      <w:r>
-        <w:br/>
-      </w:r>
-      <w:r>
-        <w:rPr>
-          <w:rStyle w:val="NormalTok"/>
-        </w:rPr>
-        <w:t xml:space="preserve">        shown </w:t>
-      </w:r>
-      <w:r>
-        <w:rPr>
-          <w:rStyle w:val="OperatorTok"/>
-        </w:rPr>
-        <w:t xml:space="preserve">=</w:t>
-      </w:r>
-      <w:r>
-        <w:rPr>
-          <w:rStyle w:val="NormalTok"/>
-        </w:rPr>
-        <w:t xml:space="preserve"> </w:t>
-      </w:r>
-      <w:r>
-        <w:rPr>
-          <w:rStyle w:val="BuiltInTok"/>
-        </w:rPr>
-        <w:t xml:space="preserve">repr</w:t>
-      </w:r>
-      <w:r>
-        <w:rPr>
-          <w:rStyle w:val="NormalTok"/>
-        </w:rPr>
-        <w:t xml:space="preserve">(char) </w:t>
-      </w:r>
-      <w:r>
-        <w:rPr>
-          <w:rStyle w:val="ControlFlowTok"/>
-        </w:rPr>
-        <w:t xml:space="preserve">if</w:t>
-      </w:r>
-      <w:r>
-        <w:rPr>
-          <w:rStyle w:val="NormalTok"/>
-        </w:rPr>
-        <w:t xml:space="preserve"> char </w:t>
-      </w:r>
-      <w:r>
-        <w:rPr>
-          <w:rStyle w:val="OperatorTok"/>
-        </w:rPr>
-        <w:t xml:space="preserve">==</w:t>
-      </w:r>
-      <w:r>
-        <w:rPr>
-          <w:rStyle w:val="NormalTok"/>
-        </w:rPr>
-        <w:t xml:space="preserve"> </w:t>
-      </w:r>
-      <w:r>
-        <w:rPr>
-          <w:rStyle w:val="StringTok"/>
-        </w:rPr>
-        <w:t xml:space="preserve">' '</w:t>
-      </w:r>
-      <w:r>
-        <w:rPr>
-          <w:rStyle w:val="NormalTok"/>
-        </w:rPr>
-        <w:t xml:space="preserve"> </w:t>
-      </w:r>
-      <w:r>
-        <w:rPr>
-          <w:rStyle w:val="ControlFlowTok"/>
-        </w:rPr>
-        <w:t xml:space="preserve">else</w:t>
-      </w:r>
-      <w:r>
-        <w:rPr>
-          <w:rStyle w:val="NormalTok"/>
-        </w:rPr>
-        <w:t xml:space="preserve"> char</w:t>
-      </w:r>
-      <w:r>
-        <w:br/>
-      </w:r>
-      <w:r>
-        <w:rPr>
-          <w:rStyle w:val="NormalTok"/>
-        </w:rPr>
-        <w:t xml:space="preserve">        </w:t>
-      </w:r>
-      <w:r>
-        <w:rPr>
-          <w:rStyle w:val="BuiltInTok"/>
-        </w:rPr>
-        <w:t xml:space="preserve">print</w:t>
-      </w:r>
-      <w:r>
-        <w:rPr>
-          <w:rStyle w:val="NormalTok"/>
-        </w:rPr>
-        <w:t xml:space="preserve">(</w:t>
-      </w:r>
-      <w:r>
-        <w:rPr>
-          <w:rStyle w:val="SpecialStringTok"/>
-        </w:rPr>
-        <w:t xml:space="preserve">f"</w:t>
-      </w:r>
-      <w:r>
-        <w:rPr>
-          <w:rStyle w:val="SpecialCharTok"/>
-        </w:rPr>
-        <w:t xml:space="preserve">{</w:t>
-      </w:r>
-      <w:r>
-        <w:rPr>
-          <w:rStyle w:val="NormalTok"/>
-        </w:rPr>
-        <w:t xml:space="preserve">shown</w:t>
-      </w:r>
-      <w:r>
-        <w:rPr>
-          <w:rStyle w:val="SpecialCharTok"/>
-        </w:rPr>
-        <w:t xml:space="preserve">:&lt;6}{</w:t>
-      </w:r>
-      <w:r>
-        <w:rPr>
-          <w:rStyle w:val="NormalTok"/>
-        </w:rPr>
-        <w:t xml:space="preserve">frequencies[char]</w:t>
-      </w:r>
-      <w:r>
-        <w:rPr>
-          <w:rStyle w:val="SpecialCharTok"/>
-        </w:rPr>
-        <w:t xml:space="preserve">:&gt;6}{</w:t>
-      </w:r>
-      <w:r>
-        <w:rPr>
-          <w:rStyle w:val="NormalTok"/>
-        </w:rPr>
-        <w:t xml:space="preserve">codes[char]</w:t>
-      </w:r>
-      <w:r>
-        <w:rPr>
-          <w:rStyle w:val="SpecialCharTok"/>
-        </w:rPr>
-        <w:t xml:space="preserve">:&gt;8}</w:t>
-      </w:r>
-      <w:r>
-        <w:rPr>
-          <w:rStyle w:val="SpecialStringTok"/>
-        </w:rPr>
-        <w:t xml:space="preserve">"</w:t>
-      </w:r>
-      <w:r>
-        <w:rPr>
-          <w:rStyle w:val="NormalTok"/>
-        </w:rPr>
-        <w:t xml:space="preserve">)</w:t>
-      </w:r>
-      <w:r>
-        <w:br/>
-      </w:r>
-      <w:r>
-        <w:br/>
-      </w:r>
-      <w:r>
-        <w:rPr>
-          <w:rStyle w:val="NormalTok"/>
-        </w:rPr>
-        <w:t xml:space="preserve">    encoded </w:t>
-      </w:r>
-      <w:r>
-        <w:rPr>
-          <w:rStyle w:val="OperatorTok"/>
-        </w:rPr>
-        <w:t xml:space="preserve">=</w:t>
-      </w:r>
-      <w:r>
-        <w:rPr>
-          <w:rStyle w:val="NormalTok"/>
-        </w:rPr>
-        <w:t xml:space="preserve"> encode(text, codes)</w:t>
-      </w:r>
-      <w:r>
-        <w:br/>
-      </w:r>
-      <w:r>
-        <w:rPr>
-          <w:rStyle w:val="NormalTok"/>
-        </w:rPr>
-        <w:t xml:space="preserve">    </w:t>
-      </w:r>
-      <w:r>
-        <w:rPr>
-          <w:rStyle w:val="BuiltInTok"/>
-        </w:rPr>
-        <w:t xml:space="preserve">print</w:t>
-      </w:r>
-      <w:r>
-        <w:rPr>
-          <w:rStyle w:val="NormalTok"/>
-        </w:rPr>
-        <w:t xml:space="preserve">(</w:t>
-      </w:r>
-      <w:r>
-        <w:rPr>
-          <w:rStyle w:val="SpecialStringTok"/>
-        </w:rPr>
-        <w:t xml:space="preserve">f"</w:t>
-      </w:r>
-      <w:r>
-        <w:rPr>
-          <w:rStyle w:val="CharTok"/>
-        </w:rPr>
-        <w:t xml:space="preserve">\n</w:t>
-      </w:r>
-      <w:r>
-        <w:rPr>
-          <w:rStyle w:val="SpecialStringTok"/>
-        </w:rPr>
-        <w:t xml:space="preserve">text    : </w:t>
-      </w:r>
-      <w:r>
-        <w:rPr>
-          <w:rStyle w:val="SpecialCharTok"/>
-        </w:rPr>
-        <w:t xml:space="preserve">{</w:t>
-      </w:r>
-      <w:r>
-        <w:rPr>
-          <w:rStyle w:val="NormalTok"/>
-        </w:rPr>
-        <w:t xml:space="preserve">text</w:t>
-      </w:r>
-      <w:r>
-        <w:rPr>
-          <w:rStyle w:val="SpecialCharTok"/>
-        </w:rPr>
-        <w:t xml:space="preserve">}</w:t>
-      </w:r>
-      <w:r>
-        <w:rPr>
-          <w:rStyle w:val="SpecialStringTok"/>
-        </w:rPr>
-        <w:t xml:space="preserve">"</w:t>
-      </w:r>
-      <w:r>
-        <w:rPr>
-          <w:rStyle w:val="NormalTok"/>
-        </w:rPr>
-        <w:t xml:space="preserve">)</w:t>
-      </w:r>
-      <w:r>
-        <w:br/>
-      </w:r>
-      <w:r>
-        <w:rPr>
-          <w:rStyle w:val="NormalTok"/>
-        </w:rPr>
-        <w:t xml:space="preserve">    </w:t>
-      </w:r>
-      <w:r>
-        <w:rPr>
-          <w:rStyle w:val="BuiltInTok"/>
-        </w:rPr>
-        <w:t xml:space="preserve">print</w:t>
-      </w:r>
-      <w:r>
-        <w:rPr>
-          <w:rStyle w:val="NormalTok"/>
-        </w:rPr>
-        <w:t xml:space="preserve">(</w:t>
-      </w:r>
-      <w:r>
-        <w:rPr>
-          <w:rStyle w:val="SpecialStringTok"/>
-        </w:rPr>
-        <w:t xml:space="preserve">f"encoded : </w:t>
-      </w:r>
-      <w:r>
-        <w:rPr>
-          <w:rStyle w:val="SpecialCharTok"/>
-        </w:rPr>
-        <w:t xml:space="preserve">{</w:t>
-      </w:r>
-      <w:r>
-        <w:rPr>
-          <w:rStyle w:val="NormalTok"/>
-        </w:rPr>
-        <w:t xml:space="preserve">encoded</w:t>
-      </w:r>
-      <w:r>
-        <w:rPr>
-          <w:rStyle w:val="SpecialCharTok"/>
-        </w:rPr>
-        <w:t xml:space="preserve">}</w:t>
-      </w:r>
-      <w:r>
-        <w:rPr>
-          <w:rStyle w:val="SpecialStringTok"/>
-        </w:rPr>
-        <w:t xml:space="preserve">  (</w:t>
-      </w:r>
-      <w:r>
-        <w:rPr>
-          <w:rStyle w:val="SpecialCharTok"/>
-        </w:rPr>
-        <w:t xml:space="preserve">{</w:t>
-      </w:r>
-      <w:r>
-        <w:rPr>
-          <w:rStyle w:val="BuiltInTok"/>
-        </w:rPr>
-        <w:t xml:space="preserve">len</w:t>
-      </w:r>
-      <w:r>
-        <w:rPr>
-          <w:rStyle w:val="NormalTok"/>
-        </w:rPr>
-        <w:t xml:space="preserve">(encoded)</w:t>
-      </w:r>
-      <w:r>
-        <w:rPr>
-          <w:rStyle w:val="SpecialCharTok"/>
-        </w:rPr>
-        <w:t xml:space="preserve">}</w:t>
-      </w:r>
-      <w:r>
-        <w:rPr>
-          <w:rStyle w:val="SpecialStringTok"/>
-        </w:rPr>
-        <w:t xml:space="preserve"> bits)"</w:t>
-      </w:r>
-      <w:r>
-        <w:rPr>
-          <w:rStyle w:val="NormalTok"/>
-        </w:rPr>
-        <w:t xml:space="preserve">)</w:t>
-      </w:r>
-      <w:r>
-        <w:br/>
-      </w:r>
-      <w:r>
-        <w:rPr>
-          <w:rStyle w:val="NormalTok"/>
-        </w:rPr>
-        <w:t xml:space="preserve">    </w:t>
-      </w:r>
-      <w:r>
-        <w:rPr>
-          <w:rStyle w:val="BuiltInTok"/>
-        </w:rPr>
-        <w:t xml:space="preserve">print</w:t>
-      </w:r>
-      <w:r>
-        <w:rPr>
-          <w:rStyle w:val="NormalTok"/>
-        </w:rPr>
-        <w:t xml:space="preserve">(</w:t>
-      </w:r>
-      <w:r>
-        <w:rPr>
-          <w:rStyle w:val="SpecialStringTok"/>
-        </w:rPr>
-        <w:t xml:space="preserve">f"decoded : </w:t>
-      </w:r>
-      <w:r>
-        <w:rPr>
-          <w:rStyle w:val="SpecialCharTok"/>
-        </w:rPr>
-        <w:t xml:space="preserve">{</w:t>
-      </w:r>
-      <w:r>
-        <w:rPr>
-          <w:rStyle w:val="NormalTok"/>
-        </w:rPr>
-        <w:t xml:space="preserve">decode(encoded, root)</w:t>
-      </w:r>
-      <w:r>
-        <w:rPr>
-          <w:rStyle w:val="SpecialCharTok"/>
-        </w:rPr>
-        <w:t xml:space="preserve">}</w:t>
-      </w:r>
-      <w:r>
-        <w:rPr>
-          <w:rStyle w:val="SpecialStringTok"/>
-        </w:rPr>
-        <w:t xml:space="preserve">"</w:t>
-      </w:r>
-      <w:r>
-        <w:rPr>
-          <w:rStyle w:val="NormalTok"/>
-        </w:rPr>
-        <w:t xml:space="preserve">)</w:t>
-      </w:r>
-      <w:r>
-        <w:br/>
-      </w:r>
-      <w:r>
-        <w:rPr>
-          <w:rStyle w:val="NormalTok"/>
-        </w:rPr>
-        <w:t xml:space="preserve">    </w:t>
-      </w:r>
-      <w:r>
-        <w:rPr>
-          <w:rStyle w:val="BuiltInTok"/>
-        </w:rPr>
-        <w:t xml:space="preserve">print</w:t>
-      </w:r>
-      <w:r>
-        <w:rPr>
-          <w:rStyle w:val="NormalTok"/>
-        </w:rPr>
-        <w:t xml:space="preserve">(</w:t>
-      </w:r>
-      <w:r>
-        <w:rPr>
-          <w:rStyle w:val="SpecialStringTok"/>
-        </w:rPr>
-        <w:t xml:space="preserve">f"lossless: </w:t>
-      </w:r>
-      <w:r>
-        <w:rPr>
-          <w:rStyle w:val="SpecialCharTok"/>
-        </w:rPr>
-        <w:t xml:space="preserve">{</w:t>
-      </w:r>
-      <w:r>
-        <w:rPr>
-          <w:rStyle w:val="NormalTok"/>
-        </w:rPr>
-        <w:t xml:space="preserve">decode(encoded, root) </w:t>
-      </w:r>
-      <w:r>
-        <w:rPr>
-          <w:rStyle w:val="OperatorTok"/>
-        </w:rPr>
-        <w:t xml:space="preserve">==</w:t>
-      </w:r>
-      <w:r>
-        <w:rPr>
-          <w:rStyle w:val="NormalTok"/>
-        </w:rPr>
-        <w:t xml:space="preserve"> text</w:t>
-      </w:r>
-      <w:r>
-        <w:rPr>
-          <w:rStyle w:val="SpecialCharTok"/>
-        </w:rPr>
-        <w:t xml:space="preserve">}</w:t>
-      </w:r>
-      <w:r>
-        <w:rPr>
-          <w:rStyle w:val="SpecialStringTok"/>
-        </w:rPr>
-        <w:t xml:space="preserve">"</w:t>
-      </w:r>
-      <w:r>
-        <w:rPr>
-          <w:rStyle w:val="NormalTok"/>
-        </w:rPr>
-        <w:t xml:space="preserve">)</w:t>
-      </w:r>
-      <w:r>
-        <w:br/>
-      </w:r>
-      <w:r>
-        <w:rPr>
-          <w:rStyle w:val="NormalTok"/>
-        </w:rPr>
-        <w:t xml:space="preserve">    </w:t>
-      </w:r>
-      <w:r>
-        <w:rPr>
-          <w:rStyle w:val="ControlFlowTok"/>
-        </w:rPr>
-        <w:t xml:space="preserve">return</w:t>
-      </w:r>
-      <w:r>
-        <w:rPr>
-          <w:rStyle w:val="NormalTok"/>
-        </w:rPr>
-        <w:t xml:space="preserve"> codes</w:t>
       </w:r>
     </w:p>
     <w:bookmarkEnd w:id="26"/>
-    <w:bookmarkStart w:id="28" w:name="X9a6f74c1721476c0bce3f17d820face46aec3be"/>
-    <w:bookmarkStart w:id="27" w:name="X5bc3766a061541058a24fefe29e36fb94bd517b"/>
+    <w:bookmarkStart w:id="27" w:name="X06d0a497809dd7070fb012541924819667a7e87"/>
+    <w:p>
+      <w:pPr>
+        <w:pStyle w:val="FirstParagraph"/>
+      </w:pPr>
+      <w:r>
+        <w:rPr>
+          <w:rStyle w:val="VerbatimChar"/>
+        </w:rPr>
+        <w:t xml:space="preserve">run</w:t>
+      </w:r>
+      <w:r>
+        <w:t xml:space="preserve"> </w:t>
+      </w:r>
+      <w:r>
+        <w:t xml:space="preserve">ties it together: build the tree, read off the codes, print the code table, then encode and</w:t>
+      </w:r>
+      <w:r>
+        <w:t xml:space="preserve"> </w:t>
+      </w:r>
+      <w:r>
+        <w:t xml:space="preserve">decode a message (and confirm the round-trip is lossless).</w:t>
+      </w:r>
+    </w:p>
+    <w:bookmarkEnd w:id="27"/>
+    <w:bookmarkStart w:id="28" w:name="b0d54092"/>
+    <w:p>
+      <w:pPr>
+        <w:pStyle w:val="SourceCode"/>
+      </w:pPr>
+    </w:p>
+    <w:bookmarkEnd w:id="28"/>
+    <w:bookmarkStart w:id="29" w:name="X379dd7426e2a32e158d61238be5b96f83db1448"/>
+    <w:p>
+      <w:pPr>
+        <w:pStyle w:val="SourceCode"/>
+      </w:pPr>
+      <w:r>
+        <w:rPr>
+          <w:rStyle w:val="KeywordTok"/>
+        </w:rPr>
+        <w:t xml:space="preserve">def</w:t>
+      </w:r>
+      <w:r>
+        <w:rPr>
+          <w:rStyle w:val="NormalTok"/>
+        </w:rPr>
+        <w:t xml:space="preserve"> run(frequencies, text):</w:t>
+      </w:r>
+      <w:r>
+        <w:br/>
+      </w:r>
+      <w:r>
+        <w:rPr>
+          <w:rStyle w:val="NormalTok"/>
+        </w:rPr>
+        <w:t xml:space="preserve">    </w:t>
+      </w:r>
+      <w:r>
+        <w:rPr>
+          <w:rStyle w:val="CommentTok"/>
+        </w:rPr>
+        <w:t xml:space="preserve">"""Build codes for these frequencies, then encode and decode text."""</w:t>
+      </w:r>
+      <w:r>
+        <w:br/>
+      </w:r>
+      <w:r>
+        <w:rPr>
+          <w:rStyle w:val="NormalTok"/>
+        </w:rPr>
+        <w:t xml:space="preserve">    root </w:t>
+      </w:r>
+      <w:r>
+        <w:rPr>
+          <w:rStyle w:val="OperatorTok"/>
+        </w:rPr>
+        <w:t xml:space="preserve">=</w:t>
+      </w:r>
+      <w:r>
+        <w:rPr>
+          <w:rStyle w:val="NormalTok"/>
+        </w:rPr>
+        <w:t xml:space="preserve"> build_tree(frequencies)</w:t>
+      </w:r>
+      <w:r>
+        <w:br/>
+      </w:r>
+      <w:r>
+        <w:rPr>
+          <w:rStyle w:val="NormalTok"/>
+        </w:rPr>
+        <w:t xml:space="preserve">    codes </w:t>
+      </w:r>
+      <w:r>
+        <w:rPr>
+          <w:rStyle w:val="OperatorTok"/>
+        </w:rPr>
+        <w:t xml:space="preserve">=</w:t>
+      </w:r>
+      <w:r>
+        <w:rPr>
+          <w:rStyle w:val="NormalTok"/>
+        </w:rPr>
+        <w:t xml:space="preserve"> build_codes(root)</w:t>
+      </w:r>
+      <w:r>
+        <w:br/>
+      </w:r>
+      <w:r>
+        <w:br/>
+      </w:r>
+      <w:r>
+        <w:rPr>
+          <w:rStyle w:val="NormalTok"/>
+        </w:rPr>
+        <w:t xml:space="preserve">    </w:t>
+      </w:r>
+      <w:r>
+        <w:rPr>
+          <w:rStyle w:val="BuiltInTok"/>
+        </w:rPr>
+        <w:t xml:space="preserve">print</w:t>
+      </w:r>
+      <w:r>
+        <w:rPr>
+          <w:rStyle w:val="NormalTok"/>
+        </w:rPr>
+        <w:t xml:space="preserve">(</w:t>
+      </w:r>
+      <w:r>
+        <w:rPr>
+          <w:rStyle w:val="SpecialStringTok"/>
+        </w:rPr>
+        <w:t xml:space="preserve">f"</w:t>
+      </w:r>
+      <w:r>
+        <w:rPr>
+          <w:rStyle w:val="SpecialCharTok"/>
+        </w:rPr>
+        <w:t xml:space="preserve">{</w:t>
+      </w:r>
+      <w:r>
+        <w:rPr>
+          <w:rStyle w:val="StringTok"/>
+        </w:rPr>
+        <w:t xml:space="preserve">'char'</w:t>
+      </w:r>
+      <w:r>
+        <w:rPr>
+          <w:rStyle w:val="SpecialCharTok"/>
+        </w:rPr>
+        <w:t xml:space="preserve">:&lt;6}{</w:t>
+      </w:r>
+      <w:r>
+        <w:rPr>
+          <w:rStyle w:val="StringTok"/>
+        </w:rPr>
+        <w:t xml:space="preserve">'freq'</w:t>
+      </w:r>
+      <w:r>
+        <w:rPr>
+          <w:rStyle w:val="SpecialCharTok"/>
+        </w:rPr>
+        <w:t xml:space="preserve">:&gt;6}{</w:t>
+      </w:r>
+      <w:r>
+        <w:rPr>
+          <w:rStyle w:val="StringTok"/>
+        </w:rPr>
+        <w:t xml:space="preserve">'code'</w:t>
+      </w:r>
+      <w:r>
+        <w:rPr>
+          <w:rStyle w:val="SpecialCharTok"/>
+        </w:rPr>
+        <w:t xml:space="preserve">:&gt;8}</w:t>
+      </w:r>
+      <w:r>
+        <w:rPr>
+          <w:rStyle w:val="SpecialStringTok"/>
+        </w:rPr>
+        <w:t xml:space="preserve">"</w:t>
+      </w:r>
+      <w:r>
+        <w:rPr>
+          <w:rStyle w:val="NormalTok"/>
+        </w:rPr>
+        <w:t xml:space="preserve">)</w:t>
+      </w:r>
+      <w:r>
+        <w:br/>
+      </w:r>
+      <w:r>
+        <w:rPr>
+          <w:rStyle w:val="NormalTok"/>
+        </w:rPr>
+        <w:t xml:space="preserve">    </w:t>
+      </w:r>
+      <w:r>
+        <w:rPr>
+          <w:rStyle w:val="ControlFlowTok"/>
+        </w:rPr>
+        <w:t xml:space="preserve">for</w:t>
+      </w:r>
+      <w:r>
+        <w:rPr>
+          <w:rStyle w:val="NormalTok"/>
+        </w:rPr>
+        <w:t xml:space="preserve"> char </w:t>
+      </w:r>
+      <w:r>
+        <w:rPr>
+          <w:rStyle w:val="KeywordTok"/>
+        </w:rPr>
+        <w:t xml:space="preserve">in</w:t>
+      </w:r>
+      <w:r>
+        <w:rPr>
+          <w:rStyle w:val="NormalTok"/>
+        </w:rPr>
+        <w:t xml:space="preserve"> </w:t>
+      </w:r>
+      <w:r>
+        <w:rPr>
+          <w:rStyle w:val="BuiltInTok"/>
+        </w:rPr>
+        <w:t xml:space="preserve">sorted</w:t>
+      </w:r>
+      <w:r>
+        <w:rPr>
+          <w:rStyle w:val="NormalTok"/>
+        </w:rPr>
+        <w:t xml:space="preserve">(codes, key</w:t>
+      </w:r>
+      <w:r>
+        <w:rPr>
+          <w:rStyle w:val="OperatorTok"/>
+        </w:rPr>
+        <w:t xml:space="preserve">=</w:t>
+      </w:r>
+      <w:r>
+        <w:rPr>
+          <w:rStyle w:val="KeywordTok"/>
+        </w:rPr>
+        <w:t xml:space="preserve">lambda</w:t>
+      </w:r>
+      <w:r>
+        <w:rPr>
+          <w:rStyle w:val="NormalTok"/>
+        </w:rPr>
+        <w:t xml:space="preserve"> c: frequencies[c]):</w:t>
+      </w:r>
+      <w:r>
+        <w:br/>
+      </w:r>
+      <w:r>
+        <w:rPr>
+          <w:rStyle w:val="NormalTok"/>
+        </w:rPr>
+        <w:t xml:space="preserve">        shown </w:t>
+      </w:r>
+      <w:r>
+        <w:rPr>
+          <w:rStyle w:val="OperatorTok"/>
+        </w:rPr>
+        <w:t xml:space="preserve">=</w:t>
+      </w:r>
+      <w:r>
+        <w:rPr>
+          <w:rStyle w:val="NormalTok"/>
+        </w:rPr>
+        <w:t xml:space="preserve"> </w:t>
+      </w:r>
+      <w:r>
+        <w:rPr>
+          <w:rStyle w:val="BuiltInTok"/>
+        </w:rPr>
+        <w:t xml:space="preserve">repr</w:t>
+      </w:r>
+      <w:r>
+        <w:rPr>
+          <w:rStyle w:val="NormalTok"/>
+        </w:rPr>
+        <w:t xml:space="preserve">(char) </w:t>
+      </w:r>
+      <w:r>
+        <w:rPr>
+          <w:rStyle w:val="ControlFlowTok"/>
+        </w:rPr>
+        <w:t xml:space="preserve">if</w:t>
+      </w:r>
+      <w:r>
+        <w:rPr>
+          <w:rStyle w:val="NormalTok"/>
+        </w:rPr>
+        <w:t xml:space="preserve"> char </w:t>
+      </w:r>
+      <w:r>
+        <w:rPr>
+          <w:rStyle w:val="OperatorTok"/>
+        </w:rPr>
+        <w:t xml:space="preserve">==</w:t>
+      </w:r>
+      <w:r>
+        <w:rPr>
+          <w:rStyle w:val="NormalTok"/>
+        </w:rPr>
+        <w:t xml:space="preserve"> </w:t>
+      </w:r>
+      <w:r>
+        <w:rPr>
+          <w:rStyle w:val="StringTok"/>
+        </w:rPr>
+        <w:t xml:space="preserve">' '</w:t>
+      </w:r>
+      <w:r>
+        <w:rPr>
+          <w:rStyle w:val="NormalTok"/>
+        </w:rPr>
+        <w:t xml:space="preserve"> </w:t>
+      </w:r>
+      <w:r>
+        <w:rPr>
+          <w:rStyle w:val="ControlFlowTok"/>
+        </w:rPr>
+        <w:t xml:space="preserve">else</w:t>
+      </w:r>
+      <w:r>
+        <w:rPr>
+          <w:rStyle w:val="NormalTok"/>
+        </w:rPr>
+        <w:t xml:space="preserve"> char</w:t>
+      </w:r>
+      <w:r>
+        <w:br/>
+      </w:r>
+      <w:r>
+        <w:rPr>
+          <w:rStyle w:val="NormalTok"/>
+        </w:rPr>
+        <w:t xml:space="preserve">        </w:t>
+      </w:r>
+      <w:r>
+        <w:rPr>
+          <w:rStyle w:val="BuiltInTok"/>
+        </w:rPr>
+        <w:t xml:space="preserve">print</w:t>
+      </w:r>
+      <w:r>
+        <w:rPr>
+          <w:rStyle w:val="NormalTok"/>
+        </w:rPr>
+        <w:t xml:space="preserve">(</w:t>
+      </w:r>
+      <w:r>
+        <w:rPr>
+          <w:rStyle w:val="SpecialStringTok"/>
+        </w:rPr>
+        <w:t xml:space="preserve">f"</w:t>
+      </w:r>
+      <w:r>
+        <w:rPr>
+          <w:rStyle w:val="SpecialCharTok"/>
+        </w:rPr>
+        <w:t xml:space="preserve">{</w:t>
+      </w:r>
+      <w:r>
+        <w:rPr>
+          <w:rStyle w:val="NormalTok"/>
+        </w:rPr>
+        <w:t xml:space="preserve">shown</w:t>
+      </w:r>
+      <w:r>
+        <w:rPr>
+          <w:rStyle w:val="SpecialCharTok"/>
+        </w:rPr>
+        <w:t xml:space="preserve">:&lt;6}{</w:t>
+      </w:r>
+      <w:r>
+        <w:rPr>
+          <w:rStyle w:val="NormalTok"/>
+        </w:rPr>
+        <w:t xml:space="preserve">frequencies[char]</w:t>
+      </w:r>
+      <w:r>
+        <w:rPr>
+          <w:rStyle w:val="SpecialCharTok"/>
+        </w:rPr>
+        <w:t xml:space="preserve">:&gt;6}{</w:t>
+      </w:r>
+      <w:r>
+        <w:rPr>
+          <w:rStyle w:val="NormalTok"/>
+        </w:rPr>
+        <w:t xml:space="preserve">codes[char]</w:t>
+      </w:r>
+      <w:r>
+        <w:rPr>
+          <w:rStyle w:val="SpecialCharTok"/>
+        </w:rPr>
+        <w:t xml:space="preserve">:&gt;8}</w:t>
+      </w:r>
+      <w:r>
+        <w:rPr>
+          <w:rStyle w:val="SpecialStringTok"/>
+        </w:rPr>
+        <w:t xml:space="preserve">"</w:t>
+      </w:r>
+      <w:r>
+        <w:rPr>
+          <w:rStyle w:val="NormalTok"/>
+        </w:rPr>
+        <w:t xml:space="preserve">)</w:t>
+      </w:r>
+      <w:r>
+        <w:br/>
+      </w:r>
+      <w:r>
+        <w:br/>
+      </w:r>
+      <w:r>
+        <w:rPr>
+          <w:rStyle w:val="NormalTok"/>
+        </w:rPr>
+        <w:t xml:space="preserve">    encoded </w:t>
+      </w:r>
+      <w:r>
+        <w:rPr>
+          <w:rStyle w:val="OperatorTok"/>
+        </w:rPr>
+        <w:t xml:space="preserve">=</w:t>
+      </w:r>
+      <w:r>
+        <w:rPr>
+          <w:rStyle w:val="NormalTok"/>
+        </w:rPr>
+        <w:t xml:space="preserve"> encode(text, codes)</w:t>
+      </w:r>
+      <w:r>
+        <w:br/>
+      </w:r>
+      <w:r>
+        <w:rPr>
+          <w:rStyle w:val="NormalTok"/>
+        </w:rPr>
+        <w:t xml:space="preserve">    </w:t>
+      </w:r>
+      <w:r>
+        <w:rPr>
+          <w:rStyle w:val="BuiltInTok"/>
+        </w:rPr>
+        <w:t xml:space="preserve">print</w:t>
+      </w:r>
+      <w:r>
+        <w:rPr>
+          <w:rStyle w:val="NormalTok"/>
+        </w:rPr>
+        <w:t xml:space="preserve">(</w:t>
+      </w:r>
+      <w:r>
+        <w:rPr>
+          <w:rStyle w:val="SpecialStringTok"/>
+        </w:rPr>
+        <w:t xml:space="preserve">f"</w:t>
+      </w:r>
+      <w:r>
+        <w:rPr>
+          <w:rStyle w:val="CharTok"/>
+        </w:rPr>
+        <w:t xml:space="preserve">\n</w:t>
+      </w:r>
+      <w:r>
+        <w:rPr>
+          <w:rStyle w:val="SpecialStringTok"/>
+        </w:rPr>
+        <w:t xml:space="preserve">text    : </w:t>
+      </w:r>
+      <w:r>
+        <w:rPr>
+          <w:rStyle w:val="SpecialCharTok"/>
+        </w:rPr>
+        <w:t xml:space="preserve">{</w:t>
+      </w:r>
+      <w:r>
+        <w:rPr>
+          <w:rStyle w:val="NormalTok"/>
+        </w:rPr>
+        <w:t xml:space="preserve">text</w:t>
+      </w:r>
+      <w:r>
+        <w:rPr>
+          <w:rStyle w:val="SpecialCharTok"/>
+        </w:rPr>
+        <w:t xml:space="preserve">}</w:t>
+      </w:r>
+      <w:r>
+        <w:rPr>
+          <w:rStyle w:val="SpecialStringTok"/>
+        </w:rPr>
+        <w:t xml:space="preserve">"</w:t>
+      </w:r>
+      <w:r>
+        <w:rPr>
+          <w:rStyle w:val="NormalTok"/>
+        </w:rPr>
+        <w:t xml:space="preserve">)</w:t>
+      </w:r>
+      <w:r>
+        <w:br/>
+      </w:r>
+      <w:r>
+        <w:rPr>
+          <w:rStyle w:val="NormalTok"/>
+        </w:rPr>
+        <w:t xml:space="preserve">    </w:t>
+      </w:r>
+      <w:r>
+        <w:rPr>
+          <w:rStyle w:val="BuiltInTok"/>
+        </w:rPr>
+        <w:t xml:space="preserve">print</w:t>
+      </w:r>
+      <w:r>
+        <w:rPr>
+          <w:rStyle w:val="NormalTok"/>
+        </w:rPr>
+        <w:t xml:space="preserve">(</w:t>
+      </w:r>
+      <w:r>
+        <w:rPr>
+          <w:rStyle w:val="SpecialStringTok"/>
+        </w:rPr>
+        <w:t xml:space="preserve">f"encoded : </w:t>
+      </w:r>
+      <w:r>
+        <w:rPr>
+          <w:rStyle w:val="SpecialCharTok"/>
+        </w:rPr>
+        <w:t xml:space="preserve">{</w:t>
+      </w:r>
+      <w:r>
+        <w:rPr>
+          <w:rStyle w:val="NormalTok"/>
+        </w:rPr>
+        <w:t xml:space="preserve">encoded</w:t>
+      </w:r>
+      <w:r>
+        <w:rPr>
+          <w:rStyle w:val="SpecialCharTok"/>
+        </w:rPr>
+        <w:t xml:space="preserve">}</w:t>
+      </w:r>
+      <w:r>
+        <w:rPr>
+          <w:rStyle w:val="SpecialStringTok"/>
+        </w:rPr>
+        <w:t xml:space="preserve">  (</w:t>
+      </w:r>
+      <w:r>
+        <w:rPr>
+          <w:rStyle w:val="SpecialCharTok"/>
+        </w:rPr>
+        <w:t xml:space="preserve">{</w:t>
+      </w:r>
+      <w:r>
+        <w:rPr>
+          <w:rStyle w:val="BuiltInTok"/>
+        </w:rPr>
+        <w:t xml:space="preserve">len</w:t>
+      </w:r>
+      <w:r>
+        <w:rPr>
+          <w:rStyle w:val="NormalTok"/>
+        </w:rPr>
+        <w:t xml:space="preserve">(encoded)</w:t>
+      </w:r>
+      <w:r>
+        <w:rPr>
+          <w:rStyle w:val="SpecialCharTok"/>
+        </w:rPr>
+        <w:t xml:space="preserve">}</w:t>
+      </w:r>
+      <w:r>
+        <w:rPr>
+          <w:rStyle w:val="SpecialStringTok"/>
+        </w:rPr>
+        <w:t xml:space="preserve"> bits)"</w:t>
+      </w:r>
+      <w:r>
+        <w:rPr>
+          <w:rStyle w:val="NormalTok"/>
+        </w:rPr>
+        <w:t xml:space="preserve">)</w:t>
+      </w:r>
+      <w:r>
+        <w:br/>
+      </w:r>
+      <w:r>
+        <w:rPr>
+          <w:rStyle w:val="NormalTok"/>
+        </w:rPr>
+        <w:t xml:space="preserve">    </w:t>
+      </w:r>
+      <w:r>
+        <w:rPr>
+          <w:rStyle w:val="BuiltInTok"/>
+        </w:rPr>
+        <w:t xml:space="preserve">print</w:t>
+      </w:r>
+      <w:r>
+        <w:rPr>
+          <w:rStyle w:val="NormalTok"/>
+        </w:rPr>
+        <w:t xml:space="preserve">(</w:t>
+      </w:r>
+      <w:r>
+        <w:rPr>
+          <w:rStyle w:val="SpecialStringTok"/>
+        </w:rPr>
+        <w:t xml:space="preserve">f"decoded : </w:t>
+      </w:r>
+      <w:r>
+        <w:rPr>
+          <w:rStyle w:val="SpecialCharTok"/>
+        </w:rPr>
+        <w:t xml:space="preserve">{</w:t>
+      </w:r>
+      <w:r>
+        <w:rPr>
+          <w:rStyle w:val="NormalTok"/>
+        </w:rPr>
+        <w:t xml:space="preserve">decode(encoded, root)</w:t>
+      </w:r>
+      <w:r>
+        <w:rPr>
+          <w:rStyle w:val="SpecialCharTok"/>
+        </w:rPr>
+        <w:t xml:space="preserve">}</w:t>
+      </w:r>
+      <w:r>
+        <w:rPr>
+          <w:rStyle w:val="SpecialStringTok"/>
+        </w:rPr>
+        <w:t xml:space="preserve">"</w:t>
+      </w:r>
+      <w:r>
+        <w:rPr>
+          <w:rStyle w:val="NormalTok"/>
+        </w:rPr>
+        <w:t xml:space="preserve">)</w:t>
+      </w:r>
+      <w:r>
+        <w:br/>
+      </w:r>
+      <w:r>
+        <w:rPr>
+          <w:rStyle w:val="NormalTok"/>
+        </w:rPr>
+        <w:t xml:space="preserve">    </w:t>
+      </w:r>
+      <w:r>
+        <w:rPr>
+          <w:rStyle w:val="BuiltInTok"/>
+        </w:rPr>
+        <w:t xml:space="preserve">print</w:t>
+      </w:r>
+      <w:r>
+        <w:rPr>
+          <w:rStyle w:val="NormalTok"/>
+        </w:rPr>
+        <w:t xml:space="preserve">(</w:t>
+      </w:r>
+      <w:r>
+        <w:rPr>
+          <w:rStyle w:val="SpecialStringTok"/>
+        </w:rPr>
+        <w:t xml:space="preserve">f"lossless: </w:t>
+      </w:r>
+      <w:r>
+        <w:rPr>
+          <w:rStyle w:val="SpecialCharTok"/>
+        </w:rPr>
+        <w:t xml:space="preserve">{</w:t>
+      </w:r>
+      <w:r>
+        <w:rPr>
+          <w:rStyle w:val="NormalTok"/>
+        </w:rPr>
+        <w:t xml:space="preserve">decode(encoded, root) </w:t>
+      </w:r>
+      <w:r>
+        <w:rPr>
+          <w:rStyle w:val="OperatorTok"/>
+        </w:rPr>
+        <w:t xml:space="preserve">==</w:t>
+      </w:r>
+      <w:r>
+        <w:rPr>
+          <w:rStyle w:val="NormalTok"/>
+        </w:rPr>
+        <w:t xml:space="preserve"> text</w:t>
+      </w:r>
+      <w:r>
+        <w:rPr>
+          <w:rStyle w:val="SpecialCharTok"/>
+        </w:rPr>
+        <w:t xml:space="preserve">}</w:t>
+      </w:r>
+      <w:r>
+        <w:rPr>
+          <w:rStyle w:val="SpecialStringTok"/>
+        </w:rPr>
+        <w:t xml:space="preserve">"</w:t>
+      </w:r>
+      <w:r>
+        <w:rPr>
+          <w:rStyle w:val="NormalTok"/>
+        </w:rPr>
+        <w:t xml:space="preserve">)</w:t>
+      </w:r>
+      <w:r>
+        <w:br/>
+      </w:r>
+      <w:r>
+        <w:rPr>
+          <w:rStyle w:val="NormalTok"/>
+        </w:rPr>
+        <w:t xml:space="preserve">    </w:t>
+      </w:r>
+      <w:r>
+        <w:rPr>
+          <w:rStyle w:val="ControlFlowTok"/>
+        </w:rPr>
+        <w:t xml:space="preserve">return</w:t>
+      </w:r>
+      <w:r>
+        <w:rPr>
+          <w:rStyle w:val="NormalTok"/>
+        </w:rPr>
+        <w:t xml:space="preserve"> codes</w:t>
+      </w:r>
+    </w:p>
+    <w:bookmarkEnd w:id="29"/>
+    <w:bookmarkStart w:id="31" w:name="X9a6f74c1721476c0bce3f17d820face46aec3be"/>
+    <w:bookmarkStart w:id="30" w:name="X5bc3766a061541058a24fefe29e36fb94bd517b"/>
     <w:p>
       <w:pPr>
         <w:pStyle w:val="Heading2"/>
@@ -2600,9 +3232,9 @@
         <w:t xml:space="preserve">.</w:t>
       </w:r>
     </w:p>
-    <w:bookmarkEnd w:id="27"/>
-    <w:bookmarkEnd w:id="28"/>
-    <w:bookmarkStart w:id="29" w:name="ec8e7a32"/>
+    <w:bookmarkEnd w:id="30"/>
+    <w:bookmarkEnd w:id="31"/>
+    <w:bookmarkStart w:id="32" w:name="ec8e7a32"/>
     <w:p>
       <w:pPr>
         <w:pStyle w:val="SourceCode"/>
@@ -2886,8 +3518,8 @@
         <w:t xml:space="preserve">lossless: True</w:t>
       </w:r>
     </w:p>
-    <w:bookmarkEnd w:id="29"/>
-    <w:bookmarkStart w:id="30" w:name="X35e5899c3583002e6101f3297f484fb405f8829"/>
+    <w:bookmarkEnd w:id="32"/>
+    <w:bookmarkStart w:id="33" w:name="X35e5899c3583002e6101f3297f484fb405f8829"/>
     <w:p>
       <w:pPr>
         <w:pStyle w:val="FirstParagraph"/>
@@ -3203,9 +3835,9 @@
         <w:t xml:space="preserve">That is the greedy rule paying off.</w:t>
       </w:r>
     </w:p>
-    <w:bookmarkEnd w:id="30"/>
-    <w:bookmarkStart w:id="32" w:name="fc31486e"/>
-    <w:bookmarkStart w:id="31" w:name="X23ae72390ed27c50ca07540705deae845c34ad2"/>
+    <w:bookmarkEnd w:id="33"/>
+    <w:bookmarkStart w:id="35" w:name="fc31486e"/>
+    <w:bookmarkStart w:id="34" w:name="X23ae72390ed27c50ca07540705deae845c34ad2"/>
     <w:p>
       <w:pPr>
         <w:pStyle w:val="Heading2"/>
@@ -3222,9 +3854,9 @@
         <w:t xml:space="preserve">Here we build the frequency table straight from a string, so the code works on any input.</w:t>
       </w:r>
     </w:p>
-    <w:bookmarkEnd w:id="31"/>
-    <w:bookmarkEnd w:id="32"/>
-    <w:bookmarkStart w:id="33" w:name="d8f0a06a"/>
+    <w:bookmarkEnd w:id="34"/>
+    <w:bookmarkEnd w:id="35"/>
+    <w:bookmarkStart w:id="36" w:name="d8f0a06a"/>
     <w:p>
       <w:pPr>
         <w:pStyle w:val="SourceCode"/>
@@ -3561,8 +4193,8 @@
         <w:t xml:space="preserve"> 'r': '1111'}</w:t>
       </w:r>
     </w:p>
-    <w:bookmarkEnd w:id="33"/>
-    <w:bookmarkStart w:id="34" w:name="Xe8e40de0a34fba9541921d4525b3573f01d885e"/>
+    <w:bookmarkEnd w:id="36"/>
+    <w:bookmarkStart w:id="37" w:name="Xe8e40de0a34fba9541921d4525b3573f01d885e"/>
     <w:p>
       <w:pPr>
         <w:pStyle w:val="FirstParagraph"/>
@@ -3640,9 +4272,9 @@
         <w:t xml:space="preserve">and decodes back exactly.</w:t>
       </w:r>
     </w:p>
-    <w:bookmarkEnd w:id="34"/>
-    <w:bookmarkStart w:id="36" w:name="X509bf176504842cc32c29a16a1f14047e7a89dc"/>
-    <w:bookmarkStart w:id="35" w:name="X1a111be2ef678bf3277df8d7f01d82baa511e27"/>
+    <w:bookmarkEnd w:id="37"/>
+    <w:bookmarkStart w:id="39" w:name="X509bf176504842cc32c29a16a1f14047e7a89dc"/>
+    <w:bookmarkStart w:id="38" w:name="X1a111be2ef678bf3277df8d7f01d82baa511e27"/>
     <w:p>
       <w:pPr>
         <w:pStyle w:val="Heading2"/>
@@ -3681,9 +4313,9 @@
         <w:t xml:space="preserve">(which needs ⌈log₂(number of symbols)⌉ bits per character).</w:t>
       </w:r>
     </w:p>
-    <w:bookmarkEnd w:id="35"/>
-    <w:bookmarkEnd w:id="36"/>
-    <w:bookmarkStart w:id="37" w:name="X9315773ec6fca471d4a1504e2c8c941a4c67349"/>
+    <w:bookmarkEnd w:id="38"/>
+    <w:bookmarkEnd w:id="39"/>
+    <w:bookmarkStart w:id="40" w:name="X9315773ec6fca471d4a1504e2c8c941a4c67349"/>
     <w:p>
       <w:pPr>
         <w:pStyle w:val="SourceCode"/>
@@ -4405,8 +5037,8 @@
         <w:t xml:space="preserve">space saving       : 25.3%</w:t>
       </w:r>
     </w:p>
-    <w:bookmarkEnd w:id="37"/>
-    <w:bookmarkStart w:id="38" w:name="Xc8cb1c6d786235077ba412f9afc386a5a0e4d77"/>
+    <w:bookmarkEnd w:id="40"/>
+    <w:bookmarkStart w:id="41" w:name="Xc8cb1c6d786235077ba412f9afc386a5a0e4d77"/>
     <w:p>
       <w:pPr>
         <w:pStyle w:val="FirstParagraph"/>
@@ -4421,9 +5053,9 @@
         <w:t xml:space="preserve">the bigger the saving. On real text (where a few letters dominate) the gain is larger still.</w:t>
       </w:r>
     </w:p>
-    <w:bookmarkEnd w:id="38"/>
-    <w:bookmarkStart w:id="40" w:name="Xb995c8ddd0831587ec9f0a2928d989e609ec758"/>
-    <w:bookmarkStart w:id="39" w:name="Xb024c6869fe8f578a7944845845297bdba1877c"/>
+    <w:bookmarkEnd w:id="41"/>
+    <w:bookmarkStart w:id="43" w:name="Xb995c8ddd0831587ec9f0a2928d989e609ec758"/>
+    <w:bookmarkStart w:id="42" w:name="Xb024c6869fe8f578a7944845845297bdba1877c"/>
     <w:p>
       <w:pPr>
         <w:pStyle w:val="Heading2"/>
@@ -4482,9 +5114,9 @@
         <w:t xml:space="preserve">and decoding still work.</w:t>
       </w:r>
     </w:p>
-    <w:bookmarkEnd w:id="39"/>
-    <w:bookmarkEnd w:id="40"/>
-    <w:bookmarkStart w:id="41" w:name="Xd4d335808847a8f670858566c74691b299c7ff3"/>
+    <w:bookmarkEnd w:id="42"/>
+    <w:bookmarkEnd w:id="43"/>
+    <w:bookmarkStart w:id="44" w:name="Xd4d335808847a8f670858566c74691b299c7ff3"/>
     <w:p>
       <w:pPr>
         <w:pStyle w:val="SourceCode"/>
@@ -4602,9 +5234,9 @@
         <w:t xml:space="preserve">{'Z': '0'}</w:t>
       </w:r>
     </w:p>
-    <w:bookmarkEnd w:id="41"/>
-    <w:bookmarkStart w:id="43" w:name="Xd068b46263f406123b7fdc0b04053d6bda68f10"/>
-    <w:bookmarkStart w:id="42" w:name="conclusion"/>
+    <w:bookmarkEnd w:id="44"/>
+    <w:bookmarkStart w:id="46" w:name="Xd068b46263f406123b7fdc0b04053d6bda68f10"/>
+    <w:bookmarkStart w:id="45" w:name="conclusion"/>
     <w:p>
       <w:pPr>
         <w:pStyle w:val="Heading2"/>
@@ -4755,8 +5387,8 @@
         <w:t xml:space="preserve">a globally optimal result — the defining property of a good greedy algorithm.</w:t>
       </w:r>
     </w:p>
-    <w:bookmarkEnd w:id="42"/>
-    <w:bookmarkEnd w:id="43"/>
+    <w:bookmarkEnd w:id="45"/>
+    <w:bookmarkEnd w:id="46"/>
     <w:sectPr>
       <w:footnotePr>
         <w:numRestart w:val="eachSect"/>

</xml_diff>